<commit_message>
Updated Report up to 1NF
</commit_message>
<xml_diff>
--- a/Big Data Tech assignment 1 part 1.docx
+++ b/Big Data Tech assignment 1 part 1.docx
@@ -139,6 +139,22 @@
     </w:p>
     <w:p>
       <w:pPr>
+        <w:spacing w:after="173"/>
+        <w:rPr>
+          <w:b/>
+          <w:bCs/>
+        </w:rPr>
+      </w:pPr>
+      <w:r>
+        <w:rPr>
+          <w:b/>
+          <w:bCs/>
+        </w:rPr>
+        <w:t>Part 1</w:t>
+      </w:r>
+    </w:p>
+    <w:p>
+      <w:pPr>
         <w:spacing w:after="199"/>
         <w:ind w:left="716"/>
       </w:pPr>
@@ -394,14 +410,246 @@
       <w:r>
         <w:t>.</w:t>
       </w:r>
-    </w:p>
-    <w:p>
-      <w:pPr>
-        <w:spacing w:after="169"/>
+      <w:r>
+        <w:t xml:space="preserve"> </w:t>
+      </w:r>
+    </w:p>
+    <w:p>
+      <w:pPr>
+        <w:spacing w:after="173"/>
         <w:ind w:left="0" w:firstLine="721"/>
       </w:pPr>
-      <w:r>
-        <w:t xml:space="preserve">Missing and unknown data in the given dataset are the date and times of pickups and dropoffs. </w:t>
+    </w:p>
+    <w:p>
+      <w:pPr>
+        <w:spacing w:after="173"/>
+        <w:rPr>
+          <w:b/>
+          <w:bCs/>
+        </w:rPr>
+      </w:pPr>
+      <w:r>
+        <w:rPr>
+          <w:b/>
+          <w:bCs/>
+        </w:rPr>
+        <w:t>Part 2</w:t>
+      </w:r>
+    </w:p>
+    <w:p>
+      <w:pPr>
+        <w:pStyle w:val="ListParagraph"/>
+        <w:numPr>
+          <w:ilvl w:val="0"/>
+          <w:numId w:val="8"/>
+        </w:numPr>
+        <w:spacing w:after="173"/>
+      </w:pPr>
+      <w:r>
+        <w:t>Original Relation:</w:t>
+      </w:r>
+    </w:p>
+    <w:p>
+      <w:pPr>
+        <w:pStyle w:val="ListParagraph"/>
+        <w:numPr>
+          <w:ilvl w:val="0"/>
+          <w:numId w:val="10"/>
+        </w:numPr>
+        <w:spacing w:after="173"/>
+      </w:pPr>
+      <w:r>
+        <w:lastRenderedPageBreak/>
+        <w:t>TAXI_TRIP(VendorID, tpep_pickup_datetime, tpep_dropoff_datetime, passenger_count, trip_distance, RatecodeID, store_and_fwd_flag, PULocationID, DOLocationID, payment_type, fare_amount, extra, mta_tax, tip_amount, tolls_amount, improvement_surcharge, total_amount, congestion_surcharge)</w:t>
+      </w:r>
+    </w:p>
+    <w:p>
+      <w:pPr>
+        <w:pStyle w:val="ListParagraph"/>
+        <w:numPr>
+          <w:ilvl w:val="0"/>
+          <w:numId w:val="10"/>
+        </w:numPr>
+        <w:spacing w:after="173"/>
+      </w:pPr>
+      <w:r>
+        <w:t>No primary key exists. No single attribute is uniq</w:t>
+      </w:r>
+      <w:r>
+        <w:t>ue because many trips begin in the same second. The most specific combination of attributes, (VendorID, tpep_pickup_datetime, tpep_dropoff_datetime, PULocationID, DOLocationID), has only</w:t>
+      </w:r>
+    </w:p>
+    <w:p>
+      <w:pPr>
+        <w:pStyle w:val="ListParagraph"/>
+        <w:numPr>
+          <w:ilvl w:val="0"/>
+          <w:numId w:val="10"/>
+        </w:numPr>
+        <w:spacing w:after="173"/>
+      </w:pPr>
+      <w:r>
+        <w:t>Because the relation has no key, no stored attribute can be relied on to determine the others. For example, the pickup time does not determine the drop-off time, and the new pickup location does not determine fare or distance. Every attribute in a row depends on the trip it describes, but no attribute in the dataset identifies a trip.</w:t>
+      </w:r>
+    </w:p>
+    <w:p>
+      <w:pPr>
+        <w:pStyle w:val="ListParagraph"/>
+        <w:numPr>
+          <w:ilvl w:val="0"/>
+          <w:numId w:val="10"/>
+        </w:numPr>
+        <w:spacing w:after="173"/>
+      </w:pPr>
+      <w:r>
+        <w:t>The original relation has several problems</w:t>
+      </w:r>
+      <w:r>
+        <w:t xml:space="preserve">. There are several rows that are identical copies of another row, and without the presence of keys there </w:t>
+      </w:r>
+      <w:r>
+        <w:t>could be separate trips or the same trip recorded twice.</w:t>
+      </w:r>
+    </w:p>
+    <w:p>
+      <w:pPr>
+        <w:pStyle w:val="ListParagraph"/>
+        <w:numPr>
+          <w:ilvl w:val="0"/>
+          <w:numId w:val="10"/>
+        </w:numPr>
+        <w:spacing w:after="173"/>
+      </w:pPr>
+      <w:r>
+        <w:t xml:space="preserve">Two changes must occur to bring the relation into 1NF First, we need a surrogate identifier we call “trip_id”, must be added to every row so that each trip, including duplicates, can be told apart. Next, the repeating group must be removed by splitting the pickup and drop-off columns into separate rows. Each now row will contain a new attribute, which we call “stop_type,” </w:t>
+      </w:r>
+      <w:r>
+        <w:t>, together with a single stop_datetime and a single location_id.</w:t>
+      </w:r>
+    </w:p>
+    <w:p>
+      <w:pPr>
+        <w:pStyle w:val="ListParagraph"/>
+        <w:numPr>
+          <w:ilvl w:val="0"/>
+          <w:numId w:val="10"/>
+        </w:numPr>
+        <w:spacing w:after="173"/>
+      </w:pPr>
+      <w:r>
+        <w:t>TAXI_TRIP satisfies three of the rules: the values are atomic, column names are unique, and the ordere in which its rows are stored does not matter. But, what disqualifies it from 1NF is a repeating group, and its rows are not guaranteed to be unique.</w:t>
+      </w:r>
+    </w:p>
+    <w:p>
+      <w:pPr>
+        <w:pStyle w:val="ListParagraph"/>
+        <w:numPr>
+          <w:ilvl w:val="0"/>
+          <w:numId w:val="8"/>
+        </w:numPr>
+        <w:spacing w:after="173"/>
+      </w:pPr>
+      <w:r>
+        <w:t>1NF</w:t>
+      </w:r>
+    </w:p>
+    <w:p>
+      <w:pPr>
+        <w:pStyle w:val="ListParagraph"/>
+        <w:numPr>
+          <w:ilvl w:val="0"/>
+          <w:numId w:val="11"/>
+        </w:numPr>
+        <w:spacing w:after="173"/>
+      </w:pPr>
+      <w:r>
+        <w:t>We add a surrogate key, trip_i</w:t>
+      </w:r>
+      <w:r>
+        <w:t>d. The repeating pickup and drop-off columns are then split into separate rows, so each trip appears as two rows, one for its pickup and one for its drop-off.</w:t>
+      </w:r>
+      <w:r>
+        <w:t xml:space="preserve"> We end up with: TRIP_1NF(trip_id, stop_type, stop_datetime, location_id, VendorID, passenger_count, trip_distance, RatecodeID, store_and_fwd_flag, payment_type, fare_amount, extra, mta_tax, tip_amount, improvement_surcharge, total_amount, congestion_surcharge)</w:t>
+      </w:r>
+    </w:p>
+    <w:p>
+      <w:pPr>
+        <w:pStyle w:val="ListParagraph"/>
+        <w:numPr>
+          <w:ilvl w:val="0"/>
+          <w:numId w:val="11"/>
+        </w:numPr>
+        <w:spacing w:after="173"/>
+      </w:pPr>
+      <w:r>
+        <w:t>After the split, trip_id alone is no longer a primary key, because every trip_id appears in two row</w:t>
+      </w:r>
+      <w:r>
+        <w:t>. The primary key is now the composite key (trip_id, stop_type)</w:t>
+      </w:r>
+      <w:r>
+        <w:t xml:space="preserve"> Because every row of the original csv file receives its own trip_id, the rows that were duplicates are now distinct.</w:t>
+      </w:r>
+    </w:p>
+    <w:p>
+      <w:pPr>
+        <w:pStyle w:val="ListParagraph"/>
+        <w:numPr>
+          <w:ilvl w:val="0"/>
+          <w:numId w:val="11"/>
+        </w:numPr>
+        <w:spacing w:after="173"/>
+      </w:pPr>
+      <w:r>
+        <w:t xml:space="preserve">There are three functional dependencies: a combination of trip_id and stop_type determines stop_datetime and location_id, because the time and place of a stop depend on both the trip and whether the stop is the pickup or the drop-off; next, trip_id alone determines the VendorID, passenger_count, trip_distance, RatecodeID, store_and_fwd_flag, payment_type, fare_amount, extra, mta_tax, tip_amount, tolls_amount, improvement_surcharge, total_amount, </w:t>
+      </w:r>
+      <w:r>
+        <w:t>congestion_surcharge, because attributes describe the trip as a whole and are identical on its pickp and drop-off rows; and lastly, each code determines its own description: VendorID determines the vendor name, RatecodeID determines the rate description, and payment_type determines the payment description.</w:t>
+      </w:r>
+    </w:p>
+    <w:p>
+      <w:pPr>
+        <w:pStyle w:val="ListParagraph"/>
+        <w:numPr>
+          <w:ilvl w:val="0"/>
+          <w:numId w:val="11"/>
+        </w:numPr>
+        <w:spacing w:after="173"/>
+      </w:pPr>
+      <w:r>
+        <w:t>The second functional dependency is a partial one, because fourteen non-key attributes depend on only part of the primary key, trip_id, rather than on the whole key. As a result, every trip-level value is stored twice, once on the pickup row and once on the drop-off now</w:t>
+      </w:r>
+      <w:r>
+        <w:t>. The redundancy leads to update, insertion, and deletion anomalies.</w:t>
+      </w:r>
+    </w:p>
+    <w:p>
+      <w:pPr>
+        <w:pStyle w:val="ListParagraph"/>
+        <w:numPr>
+          <w:ilvl w:val="0"/>
+          <w:numId w:val="11"/>
+        </w:numPr>
+        <w:spacing w:after="173"/>
+      </w:pPr>
+      <w:r>
+        <w:t>To reach 2NF, the partial dependency must be removed. The attributes that depend only on trip_id must be moved into their own table with trip_id as its primary key. Also, stop_datetime and location_id remain in a table with primary keys “trip_id”, “stop_type,” with trip_id serving as a foreign key.</w:t>
+      </w:r>
+    </w:p>
+    <w:p>
+      <w:pPr>
+        <w:pStyle w:val="ListParagraph"/>
+        <w:numPr>
+          <w:ilvl w:val="0"/>
+          <w:numId w:val="11"/>
+        </w:numPr>
+        <w:spacing w:after="173"/>
+      </w:pPr>
+      <w:r>
+        <w:t>This is 1NF because it satisfies all five rules: every attribute holds a single atomic value, every column has a unique name, and the order of rows does not affect their meaning</w:t>
+      </w:r>
+      <w:r>
+        <w:t>. No repeating groups are found. Every row is unique</w:t>
       </w:r>
     </w:p>
     <w:sectPr>
@@ -416,6 +664,742 @@
 <file path=word/numbering.xml><?xml version="1.0" encoding="utf-8"?>
 <w:numbering xmlns:wpc="http://schemas.microsoft.com/office/word/2010/wordprocessingCanvas" xmlns:cx="http://schemas.microsoft.com/office/drawing/2014/chartex" xmlns:cx1="http://schemas.microsoft.com/office/drawing/2015/9/8/chartex" xmlns:cx2="http://schemas.microsoft.com/office/drawing/2015/10/21/chartex" xmlns:cx3="http://schemas.microsoft.com/office/drawing/2016/5/9/chartex" xmlns:cx4="http://schemas.microsoft.com/office/drawing/2016/5/10/chartex" xmlns:cx5="http://schemas.microsoft.com/office/drawing/2016/5/11/chartex" xmlns:cx6="http://schemas.microsoft.com/office/drawing/2016/5/12/chartex" xmlns:cx7="http://schemas.microsoft.com/office/drawing/2016/5/13/chartex" xmlns:cx8="http://schemas.microsoft.com/office/drawing/2016/5/14/chartex" xmlns:mc="http://schemas.openxmlformats.org/markup-compatibility/2006" xmlns:aink="http://schemas.microsoft.com/office/drawing/2016/ink" xmlns:am3d="http://schemas.microsoft.com/office/drawing/2017/model3d" xmlns:o="urn:schemas-microsoft-com:office:office" xmlns:oel="http://schemas.microsoft.com/office/2019/extlst" xmlns:r="http://schemas.openxmlformats.org/officeDocument/2006/relationships" xmlns:m="http://schemas.openxmlformats.org/officeDocument/2006/math" xmlns:v="urn:schemas-microsoft-com:vml" xmlns:wp14="http://schemas.microsoft.com/office/word/2010/wordprocessingDrawing" xmlns:wp="http://schemas.openxmlformats.org/drawingml/2006/wordprocessingDrawing" xmlns:w10="urn:schemas-microsoft-com:office:word" xmlns:w="http://schemas.openxmlformats.org/wordprocessingml/2006/main" xmlns:w14="http://schemas.microsoft.com/office/word/2010/wordml" xmlns:w15="http://schemas.microsoft.com/office/word/2012/wordml" xmlns:w16cex="http://schemas.microsoft.com/office/word/2018/wordml/cex" xmlns:w16cid="http://schemas.microsoft.com/office/word/2016/wordml/cid" xmlns:w16="http://schemas.microsoft.com/office/word/2018/wordml" xmlns:w16du="http://schemas.microsoft.com/office/word/2023/wordml/word16du" xmlns:w16sdtdh="http://schemas.microsoft.com/office/word/2020/wordml/sdtdatahash" xmlns:w16sdtfl="http://schemas.microsoft.com/office/word/2024/wordml/sdtformatlock" xmlns:w16se="http://schemas.microsoft.com/office/word/2015/wordml/symex" xmlns:wpg="http://schemas.microsoft.com/office/word/2010/wordprocessingGroup" xmlns:wpi="http://schemas.microsoft.com/office/word/2010/wordprocessingInk" xmlns:wne="http://schemas.microsoft.com/office/word/2006/wordml" xmlns:wps="http://schemas.microsoft.com/office/word/2010/wordprocessingShape" mc:Ignorable="w14 w15 w16se w16cid w16 w16cex w16sdtdh w16sdtfl w16du wp14">
   <w:abstractNum w:abstractNumId="0" w15:restartNumberingAfterBreak="0">
+    <w:nsid w:val="0ACF52E8"/>
+    <w:multiLevelType w:val="hybridMultilevel"/>
+    <w:tmpl w:val="940CF356"/>
+    <w:lvl w:ilvl="0" w:tplc="0409000F">
+      <w:start w:val="1"/>
+      <w:numFmt w:val="decimal"/>
+      <w:lvlText w:val="%1."/>
+      <w:lvlJc w:val="left"/>
+      <w:pPr>
+        <w:ind w:left="1080" w:hanging="360"/>
+      </w:pPr>
+      <w:rPr>
+        <w:rFonts w:hint="default"/>
+      </w:rPr>
+    </w:lvl>
+    <w:lvl w:ilvl="1" w:tplc="04090019" w:tentative="1">
+      <w:start w:val="1"/>
+      <w:numFmt w:val="lowerLetter"/>
+      <w:lvlText w:val="%2."/>
+      <w:lvlJc w:val="left"/>
+      <w:pPr>
+        <w:ind w:left="1800" w:hanging="360"/>
+      </w:pPr>
+    </w:lvl>
+    <w:lvl w:ilvl="2" w:tplc="0409001B" w:tentative="1">
+      <w:start w:val="1"/>
+      <w:numFmt w:val="lowerRoman"/>
+      <w:lvlText w:val="%3."/>
+      <w:lvlJc w:val="right"/>
+      <w:pPr>
+        <w:ind w:left="2520" w:hanging="180"/>
+      </w:pPr>
+    </w:lvl>
+    <w:lvl w:ilvl="3" w:tplc="0409000F" w:tentative="1">
+      <w:start w:val="1"/>
+      <w:numFmt w:val="decimal"/>
+      <w:lvlText w:val="%4."/>
+      <w:lvlJc w:val="left"/>
+      <w:pPr>
+        <w:ind w:left="3240" w:hanging="360"/>
+      </w:pPr>
+    </w:lvl>
+    <w:lvl w:ilvl="4" w:tplc="04090019" w:tentative="1">
+      <w:start w:val="1"/>
+      <w:numFmt w:val="lowerLetter"/>
+      <w:lvlText w:val="%5."/>
+      <w:lvlJc w:val="left"/>
+      <w:pPr>
+        <w:ind w:left="3960" w:hanging="360"/>
+      </w:pPr>
+    </w:lvl>
+    <w:lvl w:ilvl="5" w:tplc="0409001B" w:tentative="1">
+      <w:start w:val="1"/>
+      <w:numFmt w:val="lowerRoman"/>
+      <w:lvlText w:val="%6."/>
+      <w:lvlJc w:val="right"/>
+      <w:pPr>
+        <w:ind w:left="4680" w:hanging="180"/>
+      </w:pPr>
+    </w:lvl>
+    <w:lvl w:ilvl="6" w:tplc="0409000F" w:tentative="1">
+      <w:start w:val="1"/>
+      <w:numFmt w:val="decimal"/>
+      <w:lvlText w:val="%7."/>
+      <w:lvlJc w:val="left"/>
+      <w:pPr>
+        <w:ind w:left="5400" w:hanging="360"/>
+      </w:pPr>
+    </w:lvl>
+    <w:lvl w:ilvl="7" w:tplc="04090019" w:tentative="1">
+      <w:start w:val="1"/>
+      <w:numFmt w:val="lowerLetter"/>
+      <w:lvlText w:val="%8."/>
+      <w:lvlJc w:val="left"/>
+      <w:pPr>
+        <w:ind w:left="6120" w:hanging="360"/>
+      </w:pPr>
+    </w:lvl>
+    <w:lvl w:ilvl="8" w:tplc="0409001B" w:tentative="1">
+      <w:start w:val="1"/>
+      <w:numFmt w:val="lowerRoman"/>
+      <w:lvlText w:val="%9."/>
+      <w:lvlJc w:val="right"/>
+      <w:pPr>
+        <w:ind w:left="6840" w:hanging="180"/>
+      </w:pPr>
+    </w:lvl>
+  </w:abstractNum>
+  <w:abstractNum w:abstractNumId="1" w15:restartNumberingAfterBreak="0">
+    <w:nsid w:val="15C4233C"/>
+    <w:multiLevelType w:val="hybridMultilevel"/>
+    <w:tmpl w:val="32FEA202"/>
+    <w:lvl w:ilvl="0" w:tplc="0409000F">
+      <w:start w:val="1"/>
+      <w:numFmt w:val="decimal"/>
+      <w:lvlText w:val="%1."/>
+      <w:lvlJc w:val="left"/>
+      <w:pPr>
+        <w:ind w:left="720" w:hanging="360"/>
+      </w:pPr>
+      <w:rPr>
+        <w:rFonts w:hint="default"/>
+      </w:rPr>
+    </w:lvl>
+    <w:lvl w:ilvl="1" w:tplc="04090019" w:tentative="1">
+      <w:start w:val="1"/>
+      <w:numFmt w:val="lowerLetter"/>
+      <w:lvlText w:val="%2."/>
+      <w:lvlJc w:val="left"/>
+      <w:pPr>
+        <w:ind w:left="1440" w:hanging="360"/>
+      </w:pPr>
+    </w:lvl>
+    <w:lvl w:ilvl="2" w:tplc="0409001B" w:tentative="1">
+      <w:start w:val="1"/>
+      <w:numFmt w:val="lowerRoman"/>
+      <w:lvlText w:val="%3."/>
+      <w:lvlJc w:val="right"/>
+      <w:pPr>
+        <w:ind w:left="2160" w:hanging="180"/>
+      </w:pPr>
+    </w:lvl>
+    <w:lvl w:ilvl="3" w:tplc="0409000F" w:tentative="1">
+      <w:start w:val="1"/>
+      <w:numFmt w:val="decimal"/>
+      <w:lvlText w:val="%4."/>
+      <w:lvlJc w:val="left"/>
+      <w:pPr>
+        <w:ind w:left="2880" w:hanging="360"/>
+      </w:pPr>
+    </w:lvl>
+    <w:lvl w:ilvl="4" w:tplc="04090019" w:tentative="1">
+      <w:start w:val="1"/>
+      <w:numFmt w:val="lowerLetter"/>
+      <w:lvlText w:val="%5."/>
+      <w:lvlJc w:val="left"/>
+      <w:pPr>
+        <w:ind w:left="3600" w:hanging="360"/>
+      </w:pPr>
+    </w:lvl>
+    <w:lvl w:ilvl="5" w:tplc="0409001B" w:tentative="1">
+      <w:start w:val="1"/>
+      <w:numFmt w:val="lowerRoman"/>
+      <w:lvlText w:val="%6."/>
+      <w:lvlJc w:val="right"/>
+      <w:pPr>
+        <w:ind w:left="4320" w:hanging="180"/>
+      </w:pPr>
+    </w:lvl>
+    <w:lvl w:ilvl="6" w:tplc="0409000F" w:tentative="1">
+      <w:start w:val="1"/>
+      <w:numFmt w:val="decimal"/>
+      <w:lvlText w:val="%7."/>
+      <w:lvlJc w:val="left"/>
+      <w:pPr>
+        <w:ind w:left="5040" w:hanging="360"/>
+      </w:pPr>
+    </w:lvl>
+    <w:lvl w:ilvl="7" w:tplc="04090019" w:tentative="1">
+      <w:start w:val="1"/>
+      <w:numFmt w:val="lowerLetter"/>
+      <w:lvlText w:val="%8."/>
+      <w:lvlJc w:val="left"/>
+      <w:pPr>
+        <w:ind w:left="5760" w:hanging="360"/>
+      </w:pPr>
+    </w:lvl>
+    <w:lvl w:ilvl="8" w:tplc="0409001B" w:tentative="1">
+      <w:start w:val="1"/>
+      <w:numFmt w:val="lowerRoman"/>
+      <w:lvlText w:val="%9."/>
+      <w:lvlJc w:val="right"/>
+      <w:pPr>
+        <w:ind w:left="6480" w:hanging="180"/>
+      </w:pPr>
+    </w:lvl>
+  </w:abstractNum>
+  <w:abstractNum w:abstractNumId="2" w15:restartNumberingAfterBreak="0">
+    <w:nsid w:val="2E232079"/>
+    <w:multiLevelType w:val="hybridMultilevel"/>
+    <w:tmpl w:val="D46859FC"/>
+    <w:lvl w:ilvl="0" w:tplc="0409000F">
+      <w:start w:val="1"/>
+      <w:numFmt w:val="decimal"/>
+      <w:lvlText w:val="%1."/>
+      <w:lvlJc w:val="left"/>
+      <w:pPr>
+        <w:ind w:left="720" w:hanging="360"/>
+      </w:pPr>
+      <w:rPr>
+        <w:rFonts w:hint="default"/>
+      </w:rPr>
+    </w:lvl>
+    <w:lvl w:ilvl="1" w:tplc="04090019" w:tentative="1">
+      <w:start w:val="1"/>
+      <w:numFmt w:val="lowerLetter"/>
+      <w:lvlText w:val="%2."/>
+      <w:lvlJc w:val="left"/>
+      <w:pPr>
+        <w:ind w:left="1440" w:hanging="360"/>
+      </w:pPr>
+    </w:lvl>
+    <w:lvl w:ilvl="2" w:tplc="0409001B" w:tentative="1">
+      <w:start w:val="1"/>
+      <w:numFmt w:val="lowerRoman"/>
+      <w:lvlText w:val="%3."/>
+      <w:lvlJc w:val="right"/>
+      <w:pPr>
+        <w:ind w:left="2160" w:hanging="180"/>
+      </w:pPr>
+    </w:lvl>
+    <w:lvl w:ilvl="3" w:tplc="0409000F" w:tentative="1">
+      <w:start w:val="1"/>
+      <w:numFmt w:val="decimal"/>
+      <w:lvlText w:val="%4."/>
+      <w:lvlJc w:val="left"/>
+      <w:pPr>
+        <w:ind w:left="2880" w:hanging="360"/>
+      </w:pPr>
+    </w:lvl>
+    <w:lvl w:ilvl="4" w:tplc="04090019" w:tentative="1">
+      <w:start w:val="1"/>
+      <w:numFmt w:val="lowerLetter"/>
+      <w:lvlText w:val="%5."/>
+      <w:lvlJc w:val="left"/>
+      <w:pPr>
+        <w:ind w:left="3600" w:hanging="360"/>
+      </w:pPr>
+    </w:lvl>
+    <w:lvl w:ilvl="5" w:tplc="0409001B" w:tentative="1">
+      <w:start w:val="1"/>
+      <w:numFmt w:val="lowerRoman"/>
+      <w:lvlText w:val="%6."/>
+      <w:lvlJc w:val="right"/>
+      <w:pPr>
+        <w:ind w:left="4320" w:hanging="180"/>
+      </w:pPr>
+    </w:lvl>
+    <w:lvl w:ilvl="6" w:tplc="0409000F" w:tentative="1">
+      <w:start w:val="1"/>
+      <w:numFmt w:val="decimal"/>
+      <w:lvlText w:val="%7."/>
+      <w:lvlJc w:val="left"/>
+      <w:pPr>
+        <w:ind w:left="5040" w:hanging="360"/>
+      </w:pPr>
+    </w:lvl>
+    <w:lvl w:ilvl="7" w:tplc="04090019" w:tentative="1">
+      <w:start w:val="1"/>
+      <w:numFmt w:val="lowerLetter"/>
+      <w:lvlText w:val="%8."/>
+      <w:lvlJc w:val="left"/>
+      <w:pPr>
+        <w:ind w:left="5760" w:hanging="360"/>
+      </w:pPr>
+    </w:lvl>
+    <w:lvl w:ilvl="8" w:tplc="0409001B" w:tentative="1">
+      <w:start w:val="1"/>
+      <w:numFmt w:val="lowerRoman"/>
+      <w:lvlText w:val="%9."/>
+      <w:lvlJc w:val="right"/>
+      <w:pPr>
+        <w:ind w:left="6480" w:hanging="180"/>
+      </w:pPr>
+    </w:lvl>
+  </w:abstractNum>
+  <w:abstractNum w:abstractNumId="3" w15:restartNumberingAfterBreak="0">
+    <w:nsid w:val="3CEA0CBF"/>
+    <w:multiLevelType w:val="hybridMultilevel"/>
+    <w:tmpl w:val="11F434C4"/>
+    <w:lvl w:ilvl="0" w:tplc="0409000F">
+      <w:start w:val="1"/>
+      <w:numFmt w:val="decimal"/>
+      <w:lvlText w:val="%1."/>
+      <w:lvlJc w:val="left"/>
+      <w:pPr>
+        <w:ind w:left="1800" w:hanging="360"/>
+      </w:pPr>
+      <w:rPr>
+        <w:rFonts w:hint="default"/>
+      </w:rPr>
+    </w:lvl>
+    <w:lvl w:ilvl="1" w:tplc="04090019">
+      <w:start w:val="1"/>
+      <w:numFmt w:val="lowerLetter"/>
+      <w:lvlText w:val="%2."/>
+      <w:lvlJc w:val="left"/>
+      <w:pPr>
+        <w:ind w:left="2520" w:hanging="360"/>
+      </w:pPr>
+    </w:lvl>
+    <w:lvl w:ilvl="2" w:tplc="0409001B" w:tentative="1">
+      <w:start w:val="1"/>
+      <w:numFmt w:val="lowerRoman"/>
+      <w:lvlText w:val="%3."/>
+      <w:lvlJc w:val="right"/>
+      <w:pPr>
+        <w:ind w:left="3240" w:hanging="180"/>
+      </w:pPr>
+    </w:lvl>
+    <w:lvl w:ilvl="3" w:tplc="0409000F" w:tentative="1">
+      <w:start w:val="1"/>
+      <w:numFmt w:val="decimal"/>
+      <w:lvlText w:val="%4."/>
+      <w:lvlJc w:val="left"/>
+      <w:pPr>
+        <w:ind w:left="3960" w:hanging="360"/>
+      </w:pPr>
+    </w:lvl>
+    <w:lvl w:ilvl="4" w:tplc="04090019" w:tentative="1">
+      <w:start w:val="1"/>
+      <w:numFmt w:val="lowerLetter"/>
+      <w:lvlText w:val="%5."/>
+      <w:lvlJc w:val="left"/>
+      <w:pPr>
+        <w:ind w:left="4680" w:hanging="360"/>
+      </w:pPr>
+    </w:lvl>
+    <w:lvl w:ilvl="5" w:tplc="0409001B" w:tentative="1">
+      <w:start w:val="1"/>
+      <w:numFmt w:val="lowerRoman"/>
+      <w:lvlText w:val="%6."/>
+      <w:lvlJc w:val="right"/>
+      <w:pPr>
+        <w:ind w:left="5400" w:hanging="180"/>
+      </w:pPr>
+    </w:lvl>
+    <w:lvl w:ilvl="6" w:tplc="0409000F" w:tentative="1">
+      <w:start w:val="1"/>
+      <w:numFmt w:val="decimal"/>
+      <w:lvlText w:val="%7."/>
+      <w:lvlJc w:val="left"/>
+      <w:pPr>
+        <w:ind w:left="6120" w:hanging="360"/>
+      </w:pPr>
+    </w:lvl>
+    <w:lvl w:ilvl="7" w:tplc="04090019" w:tentative="1">
+      <w:start w:val="1"/>
+      <w:numFmt w:val="lowerLetter"/>
+      <w:lvlText w:val="%8."/>
+      <w:lvlJc w:val="left"/>
+      <w:pPr>
+        <w:ind w:left="6840" w:hanging="360"/>
+      </w:pPr>
+    </w:lvl>
+    <w:lvl w:ilvl="8" w:tplc="0409001B" w:tentative="1">
+      <w:start w:val="1"/>
+      <w:numFmt w:val="lowerRoman"/>
+      <w:lvlText w:val="%9."/>
+      <w:lvlJc w:val="right"/>
+      <w:pPr>
+        <w:ind w:left="7560" w:hanging="180"/>
+      </w:pPr>
+    </w:lvl>
+  </w:abstractNum>
+  <w:abstractNum w:abstractNumId="4" w15:restartNumberingAfterBreak="0">
+    <w:nsid w:val="430A2083"/>
+    <w:multiLevelType w:val="hybridMultilevel"/>
+    <w:tmpl w:val="25A6ADA2"/>
+    <w:lvl w:ilvl="0" w:tplc="0409000F">
+      <w:start w:val="1"/>
+      <w:numFmt w:val="decimal"/>
+      <w:lvlText w:val="%1."/>
+      <w:lvlJc w:val="left"/>
+      <w:pPr>
+        <w:ind w:left="720" w:hanging="360"/>
+      </w:pPr>
+      <w:rPr>
+        <w:rFonts w:hint="default"/>
+      </w:rPr>
+    </w:lvl>
+    <w:lvl w:ilvl="1" w:tplc="04090019" w:tentative="1">
+      <w:start w:val="1"/>
+      <w:numFmt w:val="lowerLetter"/>
+      <w:lvlText w:val="%2."/>
+      <w:lvlJc w:val="left"/>
+      <w:pPr>
+        <w:ind w:left="1440" w:hanging="360"/>
+      </w:pPr>
+    </w:lvl>
+    <w:lvl w:ilvl="2" w:tplc="0409001B" w:tentative="1">
+      <w:start w:val="1"/>
+      <w:numFmt w:val="lowerRoman"/>
+      <w:lvlText w:val="%3."/>
+      <w:lvlJc w:val="right"/>
+      <w:pPr>
+        <w:ind w:left="2160" w:hanging="180"/>
+      </w:pPr>
+    </w:lvl>
+    <w:lvl w:ilvl="3" w:tplc="0409000F" w:tentative="1">
+      <w:start w:val="1"/>
+      <w:numFmt w:val="decimal"/>
+      <w:lvlText w:val="%4."/>
+      <w:lvlJc w:val="left"/>
+      <w:pPr>
+        <w:ind w:left="2880" w:hanging="360"/>
+      </w:pPr>
+    </w:lvl>
+    <w:lvl w:ilvl="4" w:tplc="04090019" w:tentative="1">
+      <w:start w:val="1"/>
+      <w:numFmt w:val="lowerLetter"/>
+      <w:lvlText w:val="%5."/>
+      <w:lvlJc w:val="left"/>
+      <w:pPr>
+        <w:ind w:left="3600" w:hanging="360"/>
+      </w:pPr>
+    </w:lvl>
+    <w:lvl w:ilvl="5" w:tplc="0409001B" w:tentative="1">
+      <w:start w:val="1"/>
+      <w:numFmt w:val="lowerRoman"/>
+      <w:lvlText w:val="%6."/>
+      <w:lvlJc w:val="right"/>
+      <w:pPr>
+        <w:ind w:left="4320" w:hanging="180"/>
+      </w:pPr>
+    </w:lvl>
+    <w:lvl w:ilvl="6" w:tplc="0409000F" w:tentative="1">
+      <w:start w:val="1"/>
+      <w:numFmt w:val="decimal"/>
+      <w:lvlText w:val="%7."/>
+      <w:lvlJc w:val="left"/>
+      <w:pPr>
+        <w:ind w:left="5040" w:hanging="360"/>
+      </w:pPr>
+    </w:lvl>
+    <w:lvl w:ilvl="7" w:tplc="04090019" w:tentative="1">
+      <w:start w:val="1"/>
+      <w:numFmt w:val="lowerLetter"/>
+      <w:lvlText w:val="%8."/>
+      <w:lvlJc w:val="left"/>
+      <w:pPr>
+        <w:ind w:left="5760" w:hanging="360"/>
+      </w:pPr>
+    </w:lvl>
+    <w:lvl w:ilvl="8" w:tplc="0409001B" w:tentative="1">
+      <w:start w:val="1"/>
+      <w:numFmt w:val="lowerRoman"/>
+      <w:lvlText w:val="%9."/>
+      <w:lvlJc w:val="right"/>
+      <w:pPr>
+        <w:ind w:left="6480" w:hanging="180"/>
+      </w:pPr>
+    </w:lvl>
+  </w:abstractNum>
+  <w:abstractNum w:abstractNumId="5" w15:restartNumberingAfterBreak="0">
+    <w:nsid w:val="443036FF"/>
+    <w:multiLevelType w:val="hybridMultilevel"/>
+    <w:tmpl w:val="85604A62"/>
+    <w:lvl w:ilvl="0" w:tplc="0409000F">
+      <w:start w:val="1"/>
+      <w:numFmt w:val="decimal"/>
+      <w:lvlText w:val="%1."/>
+      <w:lvlJc w:val="left"/>
+      <w:pPr>
+        <w:ind w:left="720" w:hanging="360"/>
+      </w:pPr>
+      <w:rPr>
+        <w:rFonts w:hint="default"/>
+      </w:rPr>
+    </w:lvl>
+    <w:lvl w:ilvl="1" w:tplc="04090019" w:tentative="1">
+      <w:start w:val="1"/>
+      <w:numFmt w:val="lowerLetter"/>
+      <w:lvlText w:val="%2."/>
+      <w:lvlJc w:val="left"/>
+      <w:pPr>
+        <w:ind w:left="1440" w:hanging="360"/>
+      </w:pPr>
+    </w:lvl>
+    <w:lvl w:ilvl="2" w:tplc="0409001B" w:tentative="1">
+      <w:start w:val="1"/>
+      <w:numFmt w:val="lowerRoman"/>
+      <w:lvlText w:val="%3."/>
+      <w:lvlJc w:val="right"/>
+      <w:pPr>
+        <w:ind w:left="2160" w:hanging="180"/>
+      </w:pPr>
+    </w:lvl>
+    <w:lvl w:ilvl="3" w:tplc="0409000F" w:tentative="1">
+      <w:start w:val="1"/>
+      <w:numFmt w:val="decimal"/>
+      <w:lvlText w:val="%4."/>
+      <w:lvlJc w:val="left"/>
+      <w:pPr>
+        <w:ind w:left="2880" w:hanging="360"/>
+      </w:pPr>
+    </w:lvl>
+    <w:lvl w:ilvl="4" w:tplc="04090019" w:tentative="1">
+      <w:start w:val="1"/>
+      <w:numFmt w:val="lowerLetter"/>
+      <w:lvlText w:val="%5."/>
+      <w:lvlJc w:val="left"/>
+      <w:pPr>
+        <w:ind w:left="3600" w:hanging="360"/>
+      </w:pPr>
+    </w:lvl>
+    <w:lvl w:ilvl="5" w:tplc="0409001B" w:tentative="1">
+      <w:start w:val="1"/>
+      <w:numFmt w:val="lowerRoman"/>
+      <w:lvlText w:val="%6."/>
+      <w:lvlJc w:val="right"/>
+      <w:pPr>
+        <w:ind w:left="4320" w:hanging="180"/>
+      </w:pPr>
+    </w:lvl>
+    <w:lvl w:ilvl="6" w:tplc="0409000F" w:tentative="1">
+      <w:start w:val="1"/>
+      <w:numFmt w:val="decimal"/>
+      <w:lvlText w:val="%7."/>
+      <w:lvlJc w:val="left"/>
+      <w:pPr>
+        <w:ind w:left="5040" w:hanging="360"/>
+      </w:pPr>
+    </w:lvl>
+    <w:lvl w:ilvl="7" w:tplc="04090019" w:tentative="1">
+      <w:start w:val="1"/>
+      <w:numFmt w:val="lowerLetter"/>
+      <w:lvlText w:val="%8."/>
+      <w:lvlJc w:val="left"/>
+      <w:pPr>
+        <w:ind w:left="5760" w:hanging="360"/>
+      </w:pPr>
+    </w:lvl>
+    <w:lvl w:ilvl="8" w:tplc="0409001B" w:tentative="1">
+      <w:start w:val="1"/>
+      <w:numFmt w:val="lowerRoman"/>
+      <w:lvlText w:val="%9."/>
+      <w:lvlJc w:val="right"/>
+      <w:pPr>
+        <w:ind w:left="6480" w:hanging="180"/>
+      </w:pPr>
+    </w:lvl>
+  </w:abstractNum>
+  <w:abstractNum w:abstractNumId="6" w15:restartNumberingAfterBreak="0">
+    <w:nsid w:val="50FB780D"/>
+    <w:multiLevelType w:val="hybridMultilevel"/>
+    <w:tmpl w:val="B7F4B600"/>
+    <w:lvl w:ilvl="0" w:tplc="04090001">
+      <w:start w:val="1"/>
+      <w:numFmt w:val="bullet"/>
+      <w:lvlText w:val=""/>
+      <w:lvlJc w:val="left"/>
+      <w:pPr>
+        <w:ind w:left="720" w:hanging="360"/>
+      </w:pPr>
+      <w:rPr>
+        <w:rFonts w:ascii="Symbol" w:hAnsi="Symbol" w:hint="default"/>
+      </w:rPr>
+    </w:lvl>
+    <w:lvl w:ilvl="1" w:tplc="04090003" w:tentative="1">
+      <w:start w:val="1"/>
+      <w:numFmt w:val="bullet"/>
+      <w:lvlText w:val="o"/>
+      <w:lvlJc w:val="left"/>
+      <w:pPr>
+        <w:ind w:left="1440" w:hanging="360"/>
+      </w:pPr>
+      <w:rPr>
+        <w:rFonts w:ascii="Courier New" w:hAnsi="Courier New" w:cs="Courier New" w:hint="default"/>
+      </w:rPr>
+    </w:lvl>
+    <w:lvl w:ilvl="2" w:tplc="04090005" w:tentative="1">
+      <w:start w:val="1"/>
+      <w:numFmt w:val="bullet"/>
+      <w:lvlText w:val=""/>
+      <w:lvlJc w:val="left"/>
+      <w:pPr>
+        <w:ind w:left="2160" w:hanging="360"/>
+      </w:pPr>
+      <w:rPr>
+        <w:rFonts w:ascii="Wingdings" w:hAnsi="Wingdings" w:hint="default"/>
+      </w:rPr>
+    </w:lvl>
+    <w:lvl w:ilvl="3" w:tplc="04090001" w:tentative="1">
+      <w:start w:val="1"/>
+      <w:numFmt w:val="bullet"/>
+      <w:lvlText w:val=""/>
+      <w:lvlJc w:val="left"/>
+      <w:pPr>
+        <w:ind w:left="2880" w:hanging="360"/>
+      </w:pPr>
+      <w:rPr>
+        <w:rFonts w:ascii="Symbol" w:hAnsi="Symbol" w:hint="default"/>
+      </w:rPr>
+    </w:lvl>
+    <w:lvl w:ilvl="4" w:tplc="04090003" w:tentative="1">
+      <w:start w:val="1"/>
+      <w:numFmt w:val="bullet"/>
+      <w:lvlText w:val="o"/>
+      <w:lvlJc w:val="left"/>
+      <w:pPr>
+        <w:ind w:left="3600" w:hanging="360"/>
+      </w:pPr>
+      <w:rPr>
+        <w:rFonts w:ascii="Courier New" w:hAnsi="Courier New" w:cs="Courier New" w:hint="default"/>
+      </w:rPr>
+    </w:lvl>
+    <w:lvl w:ilvl="5" w:tplc="04090005" w:tentative="1">
+      <w:start w:val="1"/>
+      <w:numFmt w:val="bullet"/>
+      <w:lvlText w:val=""/>
+      <w:lvlJc w:val="left"/>
+      <w:pPr>
+        <w:ind w:left="4320" w:hanging="360"/>
+      </w:pPr>
+      <w:rPr>
+        <w:rFonts w:ascii="Wingdings" w:hAnsi="Wingdings" w:hint="default"/>
+      </w:rPr>
+    </w:lvl>
+    <w:lvl w:ilvl="6" w:tplc="04090001" w:tentative="1">
+      <w:start w:val="1"/>
+      <w:numFmt w:val="bullet"/>
+      <w:lvlText w:val=""/>
+      <w:lvlJc w:val="left"/>
+      <w:pPr>
+        <w:ind w:left="5040" w:hanging="360"/>
+      </w:pPr>
+      <w:rPr>
+        <w:rFonts w:ascii="Symbol" w:hAnsi="Symbol" w:hint="default"/>
+      </w:rPr>
+    </w:lvl>
+    <w:lvl w:ilvl="7" w:tplc="04090003" w:tentative="1">
+      <w:start w:val="1"/>
+      <w:numFmt w:val="bullet"/>
+      <w:lvlText w:val="o"/>
+      <w:lvlJc w:val="left"/>
+      <w:pPr>
+        <w:ind w:left="5760" w:hanging="360"/>
+      </w:pPr>
+      <w:rPr>
+        <w:rFonts w:ascii="Courier New" w:hAnsi="Courier New" w:cs="Courier New" w:hint="default"/>
+      </w:rPr>
+    </w:lvl>
+    <w:lvl w:ilvl="8" w:tplc="04090005" w:tentative="1">
+      <w:start w:val="1"/>
+      <w:numFmt w:val="bullet"/>
+      <w:lvlText w:val=""/>
+      <w:lvlJc w:val="left"/>
+      <w:pPr>
+        <w:ind w:left="6480" w:hanging="360"/>
+      </w:pPr>
+      <w:rPr>
+        <w:rFonts w:ascii="Wingdings" w:hAnsi="Wingdings" w:hint="default"/>
+      </w:rPr>
+    </w:lvl>
+  </w:abstractNum>
+  <w:abstractNum w:abstractNumId="7" w15:restartNumberingAfterBreak="0">
+    <w:nsid w:val="5478475E"/>
+    <w:multiLevelType w:val="hybridMultilevel"/>
+    <w:tmpl w:val="1592CB48"/>
+    <w:lvl w:ilvl="0" w:tplc="30022DCA">
+      <w:start w:val="1"/>
+      <w:numFmt w:val="decimal"/>
+      <w:lvlText w:val="%1."/>
+      <w:lvlJc w:val="left"/>
+      <w:pPr>
+        <w:ind w:left="1800" w:hanging="360"/>
+      </w:pPr>
+      <w:rPr>
+        <w:rFonts w:hint="default"/>
+      </w:rPr>
+    </w:lvl>
+    <w:lvl w:ilvl="1" w:tplc="04090019" w:tentative="1">
+      <w:start w:val="1"/>
+      <w:numFmt w:val="lowerLetter"/>
+      <w:lvlText w:val="%2."/>
+      <w:lvlJc w:val="left"/>
+      <w:pPr>
+        <w:ind w:left="2520" w:hanging="360"/>
+      </w:pPr>
+    </w:lvl>
+    <w:lvl w:ilvl="2" w:tplc="0409001B" w:tentative="1">
+      <w:start w:val="1"/>
+      <w:numFmt w:val="lowerRoman"/>
+      <w:lvlText w:val="%3."/>
+      <w:lvlJc w:val="right"/>
+      <w:pPr>
+        <w:ind w:left="3240" w:hanging="180"/>
+      </w:pPr>
+    </w:lvl>
+    <w:lvl w:ilvl="3" w:tplc="0409000F" w:tentative="1">
+      <w:start w:val="1"/>
+      <w:numFmt w:val="decimal"/>
+      <w:lvlText w:val="%4."/>
+      <w:lvlJc w:val="left"/>
+      <w:pPr>
+        <w:ind w:left="3960" w:hanging="360"/>
+      </w:pPr>
+    </w:lvl>
+    <w:lvl w:ilvl="4" w:tplc="04090019" w:tentative="1">
+      <w:start w:val="1"/>
+      <w:numFmt w:val="lowerLetter"/>
+      <w:lvlText w:val="%5."/>
+      <w:lvlJc w:val="left"/>
+      <w:pPr>
+        <w:ind w:left="4680" w:hanging="360"/>
+      </w:pPr>
+    </w:lvl>
+    <w:lvl w:ilvl="5" w:tplc="0409001B" w:tentative="1">
+      <w:start w:val="1"/>
+      <w:numFmt w:val="lowerRoman"/>
+      <w:lvlText w:val="%6."/>
+      <w:lvlJc w:val="right"/>
+      <w:pPr>
+        <w:ind w:left="5400" w:hanging="180"/>
+      </w:pPr>
+    </w:lvl>
+    <w:lvl w:ilvl="6" w:tplc="0409000F" w:tentative="1">
+      <w:start w:val="1"/>
+      <w:numFmt w:val="decimal"/>
+      <w:lvlText w:val="%7."/>
+      <w:lvlJc w:val="left"/>
+      <w:pPr>
+        <w:ind w:left="6120" w:hanging="360"/>
+      </w:pPr>
+    </w:lvl>
+    <w:lvl w:ilvl="7" w:tplc="04090019" w:tentative="1">
+      <w:start w:val="1"/>
+      <w:numFmt w:val="lowerLetter"/>
+      <w:lvlText w:val="%8."/>
+      <w:lvlJc w:val="left"/>
+      <w:pPr>
+        <w:ind w:left="6840" w:hanging="360"/>
+      </w:pPr>
+    </w:lvl>
+    <w:lvl w:ilvl="8" w:tplc="0409001B" w:tentative="1">
+      <w:start w:val="1"/>
+      <w:numFmt w:val="lowerRoman"/>
+      <w:lvlText w:val="%9."/>
+      <w:lvlJc w:val="right"/>
+      <w:pPr>
+        <w:ind w:left="7560" w:hanging="180"/>
+      </w:pPr>
+    </w:lvl>
+  </w:abstractNum>
+  <w:abstractNum w:abstractNumId="8" w15:restartNumberingAfterBreak="0">
     <w:nsid w:val="5EC572F7"/>
     <w:multiLevelType w:val="hybridMultilevel"/>
     <w:tmpl w:val="6DA49942"/>
@@ -627,8 +1611,240 @@
       </w:rPr>
     </w:lvl>
   </w:abstractNum>
+  <w:abstractNum w:abstractNumId="9" w15:restartNumberingAfterBreak="0">
+    <w:nsid w:val="612D4A4B"/>
+    <w:multiLevelType w:val="hybridMultilevel"/>
+    <w:tmpl w:val="6FC8B398"/>
+    <w:lvl w:ilvl="0" w:tplc="1A128330">
+      <w:start w:val="1"/>
+      <w:numFmt w:val="bullet"/>
+      <w:lvlText w:val="-"/>
+      <w:lvlJc w:val="left"/>
+      <w:pPr>
+        <w:ind w:left="720" w:hanging="360"/>
+      </w:pPr>
+      <w:rPr>
+        <w:rFonts w:ascii="Times New Roman" w:eastAsia="Times New Roman" w:hAnsi="Times New Roman" w:cs="Times New Roman" w:hint="default"/>
+      </w:rPr>
+    </w:lvl>
+    <w:lvl w:ilvl="1" w:tplc="04090003" w:tentative="1">
+      <w:start w:val="1"/>
+      <w:numFmt w:val="bullet"/>
+      <w:lvlText w:val="o"/>
+      <w:lvlJc w:val="left"/>
+      <w:pPr>
+        <w:ind w:left="1440" w:hanging="360"/>
+      </w:pPr>
+      <w:rPr>
+        <w:rFonts w:ascii="Courier New" w:hAnsi="Courier New" w:cs="Courier New" w:hint="default"/>
+      </w:rPr>
+    </w:lvl>
+    <w:lvl w:ilvl="2" w:tplc="04090005" w:tentative="1">
+      <w:start w:val="1"/>
+      <w:numFmt w:val="bullet"/>
+      <w:lvlText w:val=""/>
+      <w:lvlJc w:val="left"/>
+      <w:pPr>
+        <w:ind w:left="2160" w:hanging="360"/>
+      </w:pPr>
+      <w:rPr>
+        <w:rFonts w:ascii="Wingdings" w:hAnsi="Wingdings" w:hint="default"/>
+      </w:rPr>
+    </w:lvl>
+    <w:lvl w:ilvl="3" w:tplc="04090001" w:tentative="1">
+      <w:start w:val="1"/>
+      <w:numFmt w:val="bullet"/>
+      <w:lvlText w:val=""/>
+      <w:lvlJc w:val="left"/>
+      <w:pPr>
+        <w:ind w:left="2880" w:hanging="360"/>
+      </w:pPr>
+      <w:rPr>
+        <w:rFonts w:ascii="Symbol" w:hAnsi="Symbol" w:hint="default"/>
+      </w:rPr>
+    </w:lvl>
+    <w:lvl w:ilvl="4" w:tplc="04090003" w:tentative="1">
+      <w:start w:val="1"/>
+      <w:numFmt w:val="bullet"/>
+      <w:lvlText w:val="o"/>
+      <w:lvlJc w:val="left"/>
+      <w:pPr>
+        <w:ind w:left="3600" w:hanging="360"/>
+      </w:pPr>
+      <w:rPr>
+        <w:rFonts w:ascii="Courier New" w:hAnsi="Courier New" w:cs="Courier New" w:hint="default"/>
+      </w:rPr>
+    </w:lvl>
+    <w:lvl w:ilvl="5" w:tplc="04090005" w:tentative="1">
+      <w:start w:val="1"/>
+      <w:numFmt w:val="bullet"/>
+      <w:lvlText w:val=""/>
+      <w:lvlJc w:val="left"/>
+      <w:pPr>
+        <w:ind w:left="4320" w:hanging="360"/>
+      </w:pPr>
+      <w:rPr>
+        <w:rFonts w:ascii="Wingdings" w:hAnsi="Wingdings" w:hint="default"/>
+      </w:rPr>
+    </w:lvl>
+    <w:lvl w:ilvl="6" w:tplc="04090001" w:tentative="1">
+      <w:start w:val="1"/>
+      <w:numFmt w:val="bullet"/>
+      <w:lvlText w:val=""/>
+      <w:lvlJc w:val="left"/>
+      <w:pPr>
+        <w:ind w:left="5040" w:hanging="360"/>
+      </w:pPr>
+      <w:rPr>
+        <w:rFonts w:ascii="Symbol" w:hAnsi="Symbol" w:hint="default"/>
+      </w:rPr>
+    </w:lvl>
+    <w:lvl w:ilvl="7" w:tplc="04090003" w:tentative="1">
+      <w:start w:val="1"/>
+      <w:numFmt w:val="bullet"/>
+      <w:lvlText w:val="o"/>
+      <w:lvlJc w:val="left"/>
+      <w:pPr>
+        <w:ind w:left="5760" w:hanging="360"/>
+      </w:pPr>
+      <w:rPr>
+        <w:rFonts w:ascii="Courier New" w:hAnsi="Courier New" w:cs="Courier New" w:hint="default"/>
+      </w:rPr>
+    </w:lvl>
+    <w:lvl w:ilvl="8" w:tplc="04090005" w:tentative="1">
+      <w:start w:val="1"/>
+      <w:numFmt w:val="bullet"/>
+      <w:lvlText w:val=""/>
+      <w:lvlJc w:val="left"/>
+      <w:pPr>
+        <w:ind w:left="6480" w:hanging="360"/>
+      </w:pPr>
+      <w:rPr>
+        <w:rFonts w:ascii="Wingdings" w:hAnsi="Wingdings" w:hint="default"/>
+      </w:rPr>
+    </w:lvl>
+  </w:abstractNum>
+  <w:abstractNum w:abstractNumId="10" w15:restartNumberingAfterBreak="0">
+    <w:nsid w:val="72964519"/>
+    <w:multiLevelType w:val="hybridMultilevel"/>
+    <w:tmpl w:val="10F0449C"/>
+    <w:lvl w:ilvl="0" w:tplc="3EC46BCC">
+      <w:start w:val="1"/>
+      <w:numFmt w:val="decimal"/>
+      <w:lvlText w:val="%1."/>
+      <w:lvlJc w:val="left"/>
+      <w:pPr>
+        <w:ind w:left="1800" w:hanging="360"/>
+      </w:pPr>
+      <w:rPr>
+        <w:rFonts w:hint="default"/>
+      </w:rPr>
+    </w:lvl>
+    <w:lvl w:ilvl="1" w:tplc="04090019" w:tentative="1">
+      <w:start w:val="1"/>
+      <w:numFmt w:val="lowerLetter"/>
+      <w:lvlText w:val="%2."/>
+      <w:lvlJc w:val="left"/>
+      <w:pPr>
+        <w:ind w:left="2520" w:hanging="360"/>
+      </w:pPr>
+    </w:lvl>
+    <w:lvl w:ilvl="2" w:tplc="0409001B" w:tentative="1">
+      <w:start w:val="1"/>
+      <w:numFmt w:val="lowerRoman"/>
+      <w:lvlText w:val="%3."/>
+      <w:lvlJc w:val="right"/>
+      <w:pPr>
+        <w:ind w:left="3240" w:hanging="180"/>
+      </w:pPr>
+    </w:lvl>
+    <w:lvl w:ilvl="3" w:tplc="0409000F" w:tentative="1">
+      <w:start w:val="1"/>
+      <w:numFmt w:val="decimal"/>
+      <w:lvlText w:val="%4."/>
+      <w:lvlJc w:val="left"/>
+      <w:pPr>
+        <w:ind w:left="3960" w:hanging="360"/>
+      </w:pPr>
+    </w:lvl>
+    <w:lvl w:ilvl="4" w:tplc="04090019" w:tentative="1">
+      <w:start w:val="1"/>
+      <w:numFmt w:val="lowerLetter"/>
+      <w:lvlText w:val="%5."/>
+      <w:lvlJc w:val="left"/>
+      <w:pPr>
+        <w:ind w:left="4680" w:hanging="360"/>
+      </w:pPr>
+    </w:lvl>
+    <w:lvl w:ilvl="5" w:tplc="0409001B" w:tentative="1">
+      <w:start w:val="1"/>
+      <w:numFmt w:val="lowerRoman"/>
+      <w:lvlText w:val="%6."/>
+      <w:lvlJc w:val="right"/>
+      <w:pPr>
+        <w:ind w:left="5400" w:hanging="180"/>
+      </w:pPr>
+    </w:lvl>
+    <w:lvl w:ilvl="6" w:tplc="0409000F" w:tentative="1">
+      <w:start w:val="1"/>
+      <w:numFmt w:val="decimal"/>
+      <w:lvlText w:val="%7."/>
+      <w:lvlJc w:val="left"/>
+      <w:pPr>
+        <w:ind w:left="6120" w:hanging="360"/>
+      </w:pPr>
+    </w:lvl>
+    <w:lvl w:ilvl="7" w:tplc="04090019" w:tentative="1">
+      <w:start w:val="1"/>
+      <w:numFmt w:val="lowerLetter"/>
+      <w:lvlText w:val="%8."/>
+      <w:lvlJc w:val="left"/>
+      <w:pPr>
+        <w:ind w:left="6840" w:hanging="360"/>
+      </w:pPr>
+    </w:lvl>
+    <w:lvl w:ilvl="8" w:tplc="0409001B" w:tentative="1">
+      <w:start w:val="1"/>
+      <w:numFmt w:val="lowerRoman"/>
+      <w:lvlText w:val="%9."/>
+      <w:lvlJc w:val="right"/>
+      <w:pPr>
+        <w:ind w:left="7560" w:hanging="180"/>
+      </w:pPr>
+    </w:lvl>
+  </w:abstractNum>
   <w:num w:numId="1" w16cid:durableId="460348908">
+    <w:abstractNumId w:val="8"/>
+  </w:num>
+  <w:num w:numId="2" w16cid:durableId="2099673166">
+    <w:abstractNumId w:val="1"/>
+  </w:num>
+  <w:num w:numId="3" w16cid:durableId="619915961">
+    <w:abstractNumId w:val="5"/>
+  </w:num>
+  <w:num w:numId="4" w16cid:durableId="208297615">
+    <w:abstractNumId w:val="2"/>
+  </w:num>
+  <w:num w:numId="5" w16cid:durableId="1609845655">
+    <w:abstractNumId w:val="4"/>
+  </w:num>
+  <w:num w:numId="6" w16cid:durableId="1158184249">
+    <w:abstractNumId w:val="6"/>
+  </w:num>
+  <w:num w:numId="7" w16cid:durableId="580918180">
+    <w:abstractNumId w:val="3"/>
+  </w:num>
+  <w:num w:numId="8" w16cid:durableId="1731490823">
+    <w:abstractNumId w:val="9"/>
+  </w:num>
+  <w:num w:numId="9" w16cid:durableId="1160341532">
     <w:abstractNumId w:val="0"/>
+  </w:num>
+  <w:num w:numId="10" w16cid:durableId="883296987">
+    <w:abstractNumId w:val="10"/>
+  </w:num>
+  <w:num w:numId="11" w16cid:durableId="19867106">
+    <w:abstractNumId w:val="7"/>
   </w:num>
 </w:numbering>
 </file>
@@ -1100,6 +2316,17 @@
       <w:sz w:val="36"/>
     </w:rPr>
   </w:style>
+  <w:style w:type="paragraph" w:styleId="ListParagraph">
+    <w:name w:val="List Paragraph"/>
+    <w:basedOn w:val="Normal"/>
+    <w:uiPriority w:val="34"/>
+    <w:qFormat/>
+    <w:rsid w:val="00CF67AF"/>
+    <w:pPr>
+      <w:ind w:left="720"/>
+      <w:contextualSpacing/>
+    </w:pPr>
+  </w:style>
 </w:styles>
 </file>
 

</xml_diff>

<commit_message>
Updated Big Data Tech assignement 1 part1.dox, completing part 2
</commit_message>
<xml_diff>
--- a/Big Data Tech assignment 1 part 1.docx
+++ b/Big Data Tech assignment 1 part 1.docx
@@ -569,7 +569,13 @@
         <w:t>d. The repeating pickup and drop-off columns are then split into separate rows, so each trip appears as two rows, one for its pickup and one for its drop-off.</w:t>
       </w:r>
       <w:r>
-        <w:t xml:space="preserve"> We end up with: TRIP_1NF(trip_id, stop_type, stop_datetime, location_id, VendorID, passenger_count, trip_distance, RatecodeID, store_and_fwd_flag, payment_type, fare_amount, extra, mta_tax, tip_amount, improvement_surcharge, total_amount, congestion_surcharge)</w:t>
+        <w:t xml:space="preserve"> We end up with: TRIP_1NF(trip_id, stop_type, stop_datetime, location_id, VendorID, passenger_count, trip_distance, RatecodeID, store_and_fwd_flag, payment_type, fare_amount, extra, mta_tax, tip_amount, </w:t>
+      </w:r>
+      <w:r>
+        <w:t xml:space="preserve">tolls_amount, </w:t>
+      </w:r>
+      <w:r>
+        <w:t>improvement_surcharge, total_amount, congestion_surcharge)</w:t>
       </w:r>
     </w:p>
     <w:p>
@@ -650,6 +656,494 @@
       </w:r>
       <w:r>
         <w:t>. No repeating groups are found. Every row is unique</w:t>
+      </w:r>
+    </w:p>
+    <w:p>
+      <w:pPr>
+        <w:pStyle w:val="ListParagraph"/>
+        <w:numPr>
+          <w:ilvl w:val="0"/>
+          <w:numId w:val="8"/>
+        </w:numPr>
+        <w:spacing w:after="173"/>
+      </w:pPr>
+      <w:r>
+        <w:t>2NF</w:t>
+      </w:r>
+    </w:p>
+    <w:p>
+      <w:pPr>
+        <w:pStyle w:val="ListParagraph"/>
+        <w:numPr>
+          <w:ilvl w:val="0"/>
+          <w:numId w:val="13"/>
+        </w:numPr>
+        <w:spacing w:after="173"/>
+      </w:pPr>
+      <w:r>
+        <w:t>The 1NF relation will be divided into seven tables:</w:t>
+      </w:r>
+    </w:p>
+    <w:p>
+      <w:pPr>
+        <w:pStyle w:val="ListParagraph"/>
+        <w:numPr>
+          <w:ilvl w:val="1"/>
+          <w:numId w:val="13"/>
+        </w:numPr>
+        <w:spacing w:after="173"/>
+      </w:pPr>
+      <w:r>
+        <w:t>VENDOR(vendor_id, vendor_name)</w:t>
+      </w:r>
+    </w:p>
+    <w:p>
+      <w:pPr>
+        <w:pStyle w:val="ListParagraph"/>
+        <w:numPr>
+          <w:ilvl w:val="2"/>
+          <w:numId w:val="13"/>
+        </w:numPr>
+        <w:spacing w:after="173"/>
+      </w:pPr>
+      <w:r>
+        <w:t xml:space="preserve">Stores </w:t>
+      </w:r>
+      <w:r>
+        <w:t>the name of each vendor that record</w:t>
+      </w:r>
+      <w:r>
+        <w:t>s</w:t>
+      </w:r>
+      <w:r>
+        <w:t xml:space="preserve"> trips</w:t>
+      </w:r>
+    </w:p>
+    <w:p>
+      <w:pPr>
+        <w:pStyle w:val="ListParagraph"/>
+        <w:numPr>
+          <w:ilvl w:val="1"/>
+          <w:numId w:val="13"/>
+        </w:numPr>
+        <w:spacing w:after="173"/>
+      </w:pPr>
+      <w:r>
+        <w:t>RATE_CODE(rateode_id, rate_description)</w:t>
+      </w:r>
+    </w:p>
+    <w:p>
+      <w:pPr>
+        <w:pStyle w:val="ListParagraph"/>
+        <w:numPr>
+          <w:ilvl w:val="1"/>
+          <w:numId w:val="13"/>
+        </w:numPr>
+        <w:spacing w:after="173"/>
+      </w:pPr>
+      <w:r>
+        <w:t>PAYMENT_TYPE(payment_type_id, payment_description)</w:t>
+      </w:r>
+    </w:p>
+    <w:p>
+      <w:pPr>
+        <w:pStyle w:val="ListParagraph"/>
+        <w:numPr>
+          <w:ilvl w:val="1"/>
+          <w:numId w:val="13"/>
+        </w:numPr>
+        <w:spacing w:after="173"/>
+      </w:pPr>
+      <w:r>
+        <w:t>LOCATION(location_id)</w:t>
+      </w:r>
+    </w:p>
+    <w:p>
+      <w:pPr>
+        <w:pStyle w:val="ListParagraph"/>
+        <w:numPr>
+          <w:ilvl w:val="1"/>
+          <w:numId w:val="13"/>
+        </w:numPr>
+        <w:spacing w:after="173"/>
+      </w:pPr>
+      <w:r>
+        <w:t>TRIP(trip_id, vendor_id, ratecode_id, passenger_count, trip_distance, store_and_fwd_flag)</w:t>
+      </w:r>
+    </w:p>
+    <w:p>
+      <w:pPr>
+        <w:pStyle w:val="ListParagraph"/>
+        <w:numPr>
+          <w:ilvl w:val="2"/>
+          <w:numId w:val="13"/>
+        </w:numPr>
+        <w:spacing w:after="173"/>
+      </w:pPr>
+      <w:r>
+        <w:t>This table stores the facts about the trip itself, i.e, the rate type, the number of passengers, the distances, and store and forward flag</w:t>
+      </w:r>
+    </w:p>
+    <w:p>
+      <w:pPr>
+        <w:pStyle w:val="ListParagraph"/>
+        <w:numPr>
+          <w:ilvl w:val="1"/>
+          <w:numId w:val="13"/>
+        </w:numPr>
+        <w:spacing w:after="173"/>
+      </w:pPr>
+      <w:r>
+        <w:t>TRIP_STOP(trip_id, stop_type, stop_datetime, location_id)</w:t>
+      </w:r>
+    </w:p>
+    <w:p>
+      <w:pPr>
+        <w:pStyle w:val="ListParagraph"/>
+        <w:numPr>
+          <w:ilvl w:val="2"/>
+          <w:numId w:val="13"/>
+        </w:numPr>
+        <w:spacing w:after="173"/>
+      </w:pPr>
+      <w:r>
+        <w:t>This table stores each trip’s pickup and dropoff as two rows, each with their own time and location</w:t>
+      </w:r>
+    </w:p>
+    <w:p>
+      <w:pPr>
+        <w:pStyle w:val="ListParagraph"/>
+        <w:numPr>
+          <w:ilvl w:val="1"/>
+          <w:numId w:val="13"/>
+        </w:numPr>
+        <w:spacing w:after="173"/>
+      </w:pPr>
+      <w:r>
+        <w:t>PAYMENT(payment_id, trip_id, payment_type_id, fare_amount, extra, mta_tax, tip_amount, tolls_amount, improvement_surcharge, congestion_surcharge, total_amount)</w:t>
+      </w:r>
+    </w:p>
+    <w:p>
+      <w:pPr>
+        <w:pStyle w:val="ListParagraph"/>
+        <w:numPr>
+          <w:ilvl w:val="2"/>
+          <w:numId w:val="13"/>
+        </w:numPr>
+        <w:spacing w:after="173"/>
+      </w:pPr>
+      <w:r>
+        <w:t>Stores the payment method and every charge for a trip</w:t>
+      </w:r>
+    </w:p>
+    <w:p>
+      <w:pPr>
+        <w:pStyle w:val="ListParagraph"/>
+        <w:numPr>
+          <w:ilvl w:val="0"/>
+          <w:numId w:val="13"/>
+        </w:numPr>
+        <w:spacing w:after="173"/>
+      </w:pPr>
+      <w:r>
+        <w:t>VENDOR, RATE_CODE, PAYMENT_TYPE, and LOCATION are each identified by their own id, which serves as a primary key</w:t>
+      </w:r>
+      <w:r>
+        <w:t>. For the other tables:</w:t>
+      </w:r>
+    </w:p>
+    <w:p>
+      <w:pPr>
+        <w:pStyle w:val="ListParagraph"/>
+        <w:numPr>
+          <w:ilvl w:val="1"/>
+          <w:numId w:val="13"/>
+        </w:numPr>
+        <w:spacing w:after="173"/>
+      </w:pPr>
+      <w:r>
+        <w:t>TRIP is identified by trip_id, and its vendor_id and ratecode_id are foreign keys</w:t>
+      </w:r>
+      <w:r>
+        <w:t xml:space="preserve"> that reference VENDOR and RATE_CODE</w:t>
+      </w:r>
+      <w:r>
+        <w:t>;</w:t>
+      </w:r>
+      <w:r>
+        <w:t xml:space="preserve"> TRIP_STOP is identified by the composite key (trip_id, stop_type);</w:t>
+      </w:r>
+      <w:r>
+        <w:t xml:space="preserve"> its trip_id is a foreign key that references TRIP and its location_id is a foreign key that references LOCATION.</w:t>
+      </w:r>
+    </w:p>
+    <w:p>
+      <w:pPr>
+        <w:pStyle w:val="ListParagraph"/>
+        <w:numPr>
+          <w:ilvl w:val="1"/>
+          <w:numId w:val="13"/>
+        </w:numPr>
+        <w:spacing w:after="173"/>
+      </w:pPr>
+      <w:r>
+        <w:t>PAYMENT is identified by payment_id</w:t>
+      </w:r>
+      <w:r>
+        <w:t>. I</w:t>
+      </w:r>
+      <w:r>
+        <w:t>t</w:t>
+      </w:r>
+      <w:r>
+        <w:t>s trip_id is a foreign key</w:t>
+      </w:r>
+      <w:r>
+        <w:t xml:space="preserve"> that references TRIP and is declared </w:t>
+      </w:r>
+      <w:r>
+        <w:t>UNIQUE</w:t>
+      </w:r>
+      <w:r>
+        <w:t xml:space="preserve"> so that each trip has only one payment record, and it’s payment_</w:t>
+      </w:r>
+      <w:r>
+        <w:t>type_</w:t>
+      </w:r>
+      <w:r>
+        <w:t xml:space="preserve">id is </w:t>
+      </w:r>
+      <w:r>
+        <w:t xml:space="preserve">its </w:t>
+      </w:r>
+      <w:r>
+        <w:t>foreign</w:t>
+      </w:r>
+      <w:r>
+        <w:t xml:space="preserve"> key that references PAYMENT_TYPE</w:t>
+      </w:r>
+    </w:p>
+    <w:p>
+      <w:pPr>
+        <w:pStyle w:val="ListParagraph"/>
+        <w:numPr>
+          <w:ilvl w:val="0"/>
+          <w:numId w:val="13"/>
+        </w:numPr>
+        <w:spacing w:after="173"/>
+      </w:pPr>
+      <w:r>
+        <w:t>Each table now contains only dependencies of its own primary key:</w:t>
+      </w:r>
+    </w:p>
+    <w:p>
+      <w:pPr>
+        <w:pStyle w:val="ListParagraph"/>
+        <w:numPr>
+          <w:ilvl w:val="1"/>
+          <w:numId w:val="13"/>
+        </w:numPr>
+        <w:spacing w:after="173"/>
+      </w:pPr>
+      <w:r>
+        <w:t>For VENDOR, vendor_id determines vendor_name</w:t>
+      </w:r>
+    </w:p>
+    <w:p>
+      <w:pPr>
+        <w:pStyle w:val="ListParagraph"/>
+        <w:numPr>
+          <w:ilvl w:val="1"/>
+          <w:numId w:val="13"/>
+        </w:numPr>
+        <w:spacing w:after="173"/>
+      </w:pPr>
+      <w:r>
+        <w:t>In RATE_CODE, ratecode_id determines rate_description</w:t>
+      </w:r>
+    </w:p>
+    <w:p>
+      <w:pPr>
+        <w:pStyle w:val="ListParagraph"/>
+        <w:numPr>
+          <w:ilvl w:val="1"/>
+          <w:numId w:val="13"/>
+        </w:numPr>
+        <w:spacing w:after="173"/>
+      </w:pPr>
+      <w:r>
+        <w:t>PAYMENT_TYPE, payment_type_id determines payement_description</w:t>
+      </w:r>
+    </w:p>
+    <w:p>
+      <w:pPr>
+        <w:pStyle w:val="ListParagraph"/>
+        <w:numPr>
+          <w:ilvl w:val="1"/>
+          <w:numId w:val="13"/>
+        </w:numPr>
+        <w:spacing w:after="173"/>
+      </w:pPr>
+      <w:r>
+        <w:t>LOCATION has no non-key attributes</w:t>
+      </w:r>
+    </w:p>
+    <w:p>
+      <w:pPr>
+        <w:pStyle w:val="ListParagraph"/>
+        <w:numPr>
+          <w:ilvl w:val="1"/>
+          <w:numId w:val="13"/>
+        </w:numPr>
+        <w:spacing w:after="173"/>
+      </w:pPr>
+      <w:r>
+        <w:t>TRIP has trip_id determine the vendor_id, ratecode_id, passenger_count, trip_distance, and store_and_fwd_flag</w:t>
+      </w:r>
+    </w:p>
+    <w:p>
+      <w:pPr>
+        <w:pStyle w:val="ListParagraph"/>
+        <w:numPr>
+          <w:ilvl w:val="1"/>
+          <w:numId w:val="13"/>
+        </w:numPr>
+        <w:spacing w:after="173"/>
+      </w:pPr>
+      <w:r>
+        <w:t>TRIP_STOP has the combination of trip_id and stop_type determines stop_datetime and location_id</w:t>
+      </w:r>
+    </w:p>
+    <w:p>
+      <w:pPr>
+        <w:pStyle w:val="ListParagraph"/>
+        <w:numPr>
+          <w:ilvl w:val="1"/>
+          <w:numId w:val="13"/>
+        </w:numPr>
+        <w:spacing w:after="173"/>
+      </w:pPr>
+      <w:r>
+        <w:t>PAYMENT</w:t>
+      </w:r>
+      <w:r>
+        <w:t xml:space="preserve"> has payement_id determine trip_id, payment_type_id, and all eight attributes</w:t>
+      </w:r>
+      <w:r>
+        <w:t>. Because trip_id is unique in PAYMENT, trip_id also determines payment_id</w:t>
+      </w:r>
+      <w:r>
+        <w:t>. The attribute total_amount is kept as a stored value rather than treated as derived, because it equls the sum of other charges, so it cannot be reliably calculated from them</w:t>
+      </w:r>
+      <w:r>
+        <w:t>.</w:t>
+      </w:r>
+    </w:p>
+    <w:p>
+      <w:pPr>
+        <w:pStyle w:val="ListParagraph"/>
+        <w:numPr>
+          <w:ilvl w:val="0"/>
+          <w:numId w:val="13"/>
+        </w:numPr>
+        <w:spacing w:after="173"/>
+      </w:pPr>
+      <w:r>
+        <w:t>Redundancy that was identified in the 1NF stage has been removed:</w:t>
+      </w:r>
+    </w:p>
+    <w:p>
+      <w:pPr>
+        <w:pStyle w:val="ListParagraph"/>
+        <w:numPr>
+          <w:ilvl w:val="1"/>
+          <w:numId w:val="13"/>
+        </w:numPr>
+        <w:spacing w:after="173"/>
+      </w:pPr>
+      <w:r>
+        <w:t>Each trip’s details and charges are now stored once instead of twice</w:t>
+      </w:r>
+    </w:p>
+    <w:p>
+      <w:pPr>
+        <w:pStyle w:val="ListParagraph"/>
+        <w:numPr>
+          <w:ilvl w:val="1"/>
+          <w:numId w:val="13"/>
+        </w:numPr>
+        <w:spacing w:after="173"/>
+      </w:pPr>
+      <w:r>
+        <w:t xml:space="preserve">Each code’s meaning is stored once in its own table rather than being implied </w:t>
+      </w:r>
+      <w:r>
+        <w:t>across millions of rows.</w:t>
+      </w:r>
+    </w:p>
+    <w:p>
+      <w:pPr>
+        <w:pStyle w:val="ListParagraph"/>
+        <w:numPr>
+          <w:ilvl w:val="1"/>
+          <w:numId w:val="13"/>
+        </w:numPr>
+        <w:spacing w:after="173"/>
+      </w:pPr>
+      <w:r>
+        <w:t>The only values that still repeat are foreign keys, i.e. the same vendor_id appearing in many trip rows.</w:t>
+      </w:r>
+    </w:p>
+    <w:p>
+      <w:pPr>
+        <w:pStyle w:val="ListParagraph"/>
+        <w:numPr>
+          <w:ilvl w:val="0"/>
+          <w:numId w:val="13"/>
+        </w:numPr>
+        <w:spacing w:after="173"/>
+      </w:pPr>
+      <w:r>
+        <w:t>No further changes were required</w:t>
+      </w:r>
+    </w:p>
+    <w:p>
+      <w:pPr>
+        <w:pStyle w:val="ListParagraph"/>
+        <w:numPr>
+          <w:ilvl w:val="0"/>
+          <w:numId w:val="13"/>
+        </w:numPr>
+        <w:spacing w:after="173"/>
+      </w:pPr>
+      <w:r>
+        <w:t>It is 2NF because every table in the final design is already in 1NF, and none of them contains a partial dependency:</w:t>
+      </w:r>
+    </w:p>
+    <w:p>
+      <w:pPr>
+        <w:pStyle w:val="ListParagraph"/>
+        <w:numPr>
+          <w:ilvl w:val="1"/>
+          <w:numId w:val="13"/>
+        </w:numPr>
+        <w:spacing w:after="173"/>
+      </w:pPr>
+      <w:r>
+        <w:t>TRIP, PAYMENT, VENDOR, RATE_CODE, PAYMENT_TYPE, and LOCATION each have a single-attribute primary key, so no non-key attribute can depend on only part of a key.</w:t>
+      </w:r>
+    </w:p>
+    <w:p>
+      <w:pPr>
+        <w:pStyle w:val="ListParagraph"/>
+        <w:numPr>
+          <w:ilvl w:val="1"/>
+          <w:numId w:val="13"/>
+        </w:numPr>
+        <w:spacing w:after="173"/>
+      </w:pPr>
+      <w:r>
+        <w:t xml:space="preserve">TRIP_STOP is the only table with a composite key. It’s two non-key attributes, stop_datetime and location_id, depend on the whole key, because a stop’s time and place depend on both the trip and whether the stop is the pickup or the dropoff. </w:t>
       </w:r>
     </w:p>
     <w:sectPr>
@@ -753,6 +1247,95 @@
     </w:lvl>
   </w:abstractNum>
   <w:abstractNum w:abstractNumId="1" w15:restartNumberingAfterBreak="0">
+    <w:nsid w:val="127D7A69"/>
+    <w:multiLevelType w:val="hybridMultilevel"/>
+    <w:tmpl w:val="2EBA078A"/>
+    <w:lvl w:ilvl="0" w:tplc="0409000F">
+      <w:start w:val="1"/>
+      <w:numFmt w:val="decimal"/>
+      <w:lvlText w:val="%1."/>
+      <w:lvlJc w:val="left"/>
+      <w:pPr>
+        <w:ind w:left="1800" w:hanging="360"/>
+      </w:pPr>
+      <w:rPr>
+        <w:rFonts w:hint="default"/>
+      </w:rPr>
+    </w:lvl>
+    <w:lvl w:ilvl="1" w:tplc="04090019">
+      <w:start w:val="1"/>
+      <w:numFmt w:val="lowerLetter"/>
+      <w:lvlText w:val="%2."/>
+      <w:lvlJc w:val="left"/>
+      <w:pPr>
+        <w:ind w:left="2520" w:hanging="360"/>
+      </w:pPr>
+    </w:lvl>
+    <w:lvl w:ilvl="2" w:tplc="0409001B">
+      <w:start w:val="1"/>
+      <w:numFmt w:val="lowerRoman"/>
+      <w:lvlText w:val="%3."/>
+      <w:lvlJc w:val="right"/>
+      <w:pPr>
+        <w:ind w:left="3240" w:hanging="180"/>
+      </w:pPr>
+    </w:lvl>
+    <w:lvl w:ilvl="3" w:tplc="0409000F" w:tentative="1">
+      <w:start w:val="1"/>
+      <w:numFmt w:val="decimal"/>
+      <w:lvlText w:val="%4."/>
+      <w:lvlJc w:val="left"/>
+      <w:pPr>
+        <w:ind w:left="3960" w:hanging="360"/>
+      </w:pPr>
+    </w:lvl>
+    <w:lvl w:ilvl="4" w:tplc="04090019" w:tentative="1">
+      <w:start w:val="1"/>
+      <w:numFmt w:val="lowerLetter"/>
+      <w:lvlText w:val="%5."/>
+      <w:lvlJc w:val="left"/>
+      <w:pPr>
+        <w:ind w:left="4680" w:hanging="360"/>
+      </w:pPr>
+    </w:lvl>
+    <w:lvl w:ilvl="5" w:tplc="0409001B" w:tentative="1">
+      <w:start w:val="1"/>
+      <w:numFmt w:val="lowerRoman"/>
+      <w:lvlText w:val="%6."/>
+      <w:lvlJc w:val="right"/>
+      <w:pPr>
+        <w:ind w:left="5400" w:hanging="180"/>
+      </w:pPr>
+    </w:lvl>
+    <w:lvl w:ilvl="6" w:tplc="0409000F" w:tentative="1">
+      <w:start w:val="1"/>
+      <w:numFmt w:val="decimal"/>
+      <w:lvlText w:val="%7."/>
+      <w:lvlJc w:val="left"/>
+      <w:pPr>
+        <w:ind w:left="6120" w:hanging="360"/>
+      </w:pPr>
+    </w:lvl>
+    <w:lvl w:ilvl="7" w:tplc="04090019" w:tentative="1">
+      <w:start w:val="1"/>
+      <w:numFmt w:val="lowerLetter"/>
+      <w:lvlText w:val="%8."/>
+      <w:lvlJc w:val="left"/>
+      <w:pPr>
+        <w:ind w:left="6840" w:hanging="360"/>
+      </w:pPr>
+    </w:lvl>
+    <w:lvl w:ilvl="8" w:tplc="0409001B" w:tentative="1">
+      <w:start w:val="1"/>
+      <w:numFmt w:val="lowerRoman"/>
+      <w:lvlText w:val="%9."/>
+      <w:lvlJc w:val="right"/>
+      <w:pPr>
+        <w:ind w:left="7560" w:hanging="180"/>
+      </w:pPr>
+    </w:lvl>
+  </w:abstractNum>
+  <w:abstractNum w:abstractNumId="2" w15:restartNumberingAfterBreak="0">
     <w:nsid w:val="15C4233C"/>
     <w:multiLevelType w:val="hybridMultilevel"/>
     <w:tmpl w:val="32FEA202"/>
@@ -841,7 +1424,7 @@
       </w:pPr>
     </w:lvl>
   </w:abstractNum>
-  <w:abstractNum w:abstractNumId="2" w15:restartNumberingAfterBreak="0">
+  <w:abstractNum w:abstractNumId="3" w15:restartNumberingAfterBreak="0">
     <w:nsid w:val="2E232079"/>
     <w:multiLevelType w:val="hybridMultilevel"/>
     <w:tmpl w:val="D46859FC"/>
@@ -930,7 +1513,96 @@
       </w:pPr>
     </w:lvl>
   </w:abstractNum>
-  <w:abstractNum w:abstractNumId="3" w15:restartNumberingAfterBreak="0">
+  <w:abstractNum w:abstractNumId="4" w15:restartNumberingAfterBreak="0">
+    <w:nsid w:val="33DA7221"/>
+    <w:multiLevelType w:val="hybridMultilevel"/>
+    <w:tmpl w:val="ED7E7C38"/>
+    <w:lvl w:ilvl="0" w:tplc="B128D6BE">
+      <w:start w:val="1"/>
+      <w:numFmt w:val="decimal"/>
+      <w:lvlText w:val="%1."/>
+      <w:lvlJc w:val="left"/>
+      <w:pPr>
+        <w:ind w:left="1800" w:hanging="360"/>
+      </w:pPr>
+      <w:rPr>
+        <w:rFonts w:hint="default"/>
+      </w:rPr>
+    </w:lvl>
+    <w:lvl w:ilvl="1" w:tplc="04090019" w:tentative="1">
+      <w:start w:val="1"/>
+      <w:numFmt w:val="lowerLetter"/>
+      <w:lvlText w:val="%2."/>
+      <w:lvlJc w:val="left"/>
+      <w:pPr>
+        <w:ind w:left="2520" w:hanging="360"/>
+      </w:pPr>
+    </w:lvl>
+    <w:lvl w:ilvl="2" w:tplc="0409001B" w:tentative="1">
+      <w:start w:val="1"/>
+      <w:numFmt w:val="lowerRoman"/>
+      <w:lvlText w:val="%3."/>
+      <w:lvlJc w:val="right"/>
+      <w:pPr>
+        <w:ind w:left="3240" w:hanging="180"/>
+      </w:pPr>
+    </w:lvl>
+    <w:lvl w:ilvl="3" w:tplc="0409000F" w:tentative="1">
+      <w:start w:val="1"/>
+      <w:numFmt w:val="decimal"/>
+      <w:lvlText w:val="%4."/>
+      <w:lvlJc w:val="left"/>
+      <w:pPr>
+        <w:ind w:left="3960" w:hanging="360"/>
+      </w:pPr>
+    </w:lvl>
+    <w:lvl w:ilvl="4" w:tplc="04090019" w:tentative="1">
+      <w:start w:val="1"/>
+      <w:numFmt w:val="lowerLetter"/>
+      <w:lvlText w:val="%5."/>
+      <w:lvlJc w:val="left"/>
+      <w:pPr>
+        <w:ind w:left="4680" w:hanging="360"/>
+      </w:pPr>
+    </w:lvl>
+    <w:lvl w:ilvl="5" w:tplc="0409001B" w:tentative="1">
+      <w:start w:val="1"/>
+      <w:numFmt w:val="lowerRoman"/>
+      <w:lvlText w:val="%6."/>
+      <w:lvlJc w:val="right"/>
+      <w:pPr>
+        <w:ind w:left="5400" w:hanging="180"/>
+      </w:pPr>
+    </w:lvl>
+    <w:lvl w:ilvl="6" w:tplc="0409000F" w:tentative="1">
+      <w:start w:val="1"/>
+      <w:numFmt w:val="decimal"/>
+      <w:lvlText w:val="%7."/>
+      <w:lvlJc w:val="left"/>
+      <w:pPr>
+        <w:ind w:left="6120" w:hanging="360"/>
+      </w:pPr>
+    </w:lvl>
+    <w:lvl w:ilvl="7" w:tplc="04090019" w:tentative="1">
+      <w:start w:val="1"/>
+      <w:numFmt w:val="lowerLetter"/>
+      <w:lvlText w:val="%8."/>
+      <w:lvlJc w:val="left"/>
+      <w:pPr>
+        <w:ind w:left="6840" w:hanging="360"/>
+      </w:pPr>
+    </w:lvl>
+    <w:lvl w:ilvl="8" w:tplc="0409001B" w:tentative="1">
+      <w:start w:val="1"/>
+      <w:numFmt w:val="lowerRoman"/>
+      <w:lvlText w:val="%9."/>
+      <w:lvlJc w:val="right"/>
+      <w:pPr>
+        <w:ind w:left="7560" w:hanging="180"/>
+      </w:pPr>
+    </w:lvl>
+  </w:abstractNum>
+  <w:abstractNum w:abstractNumId="5" w15:restartNumberingAfterBreak="0">
     <w:nsid w:val="3CEA0CBF"/>
     <w:multiLevelType w:val="hybridMultilevel"/>
     <w:tmpl w:val="11F434C4"/>
@@ -1019,7 +1691,7 @@
       </w:pPr>
     </w:lvl>
   </w:abstractNum>
-  <w:abstractNum w:abstractNumId="4" w15:restartNumberingAfterBreak="0">
+  <w:abstractNum w:abstractNumId="6" w15:restartNumberingAfterBreak="0">
     <w:nsid w:val="430A2083"/>
     <w:multiLevelType w:val="hybridMultilevel"/>
     <w:tmpl w:val="25A6ADA2"/>
@@ -1108,7 +1780,7 @@
       </w:pPr>
     </w:lvl>
   </w:abstractNum>
-  <w:abstractNum w:abstractNumId="5" w15:restartNumberingAfterBreak="0">
+  <w:abstractNum w:abstractNumId="7" w15:restartNumberingAfterBreak="0">
     <w:nsid w:val="443036FF"/>
     <w:multiLevelType w:val="hybridMultilevel"/>
     <w:tmpl w:val="85604A62"/>
@@ -1197,7 +1869,7 @@
       </w:pPr>
     </w:lvl>
   </w:abstractNum>
-  <w:abstractNum w:abstractNumId="6" w15:restartNumberingAfterBreak="0">
+  <w:abstractNum w:abstractNumId="8" w15:restartNumberingAfterBreak="0">
     <w:nsid w:val="50FB780D"/>
     <w:multiLevelType w:val="hybridMultilevel"/>
     <w:tmpl w:val="B7F4B600"/>
@@ -1310,7 +1982,7 @@
       </w:rPr>
     </w:lvl>
   </w:abstractNum>
-  <w:abstractNum w:abstractNumId="7" w15:restartNumberingAfterBreak="0">
+  <w:abstractNum w:abstractNumId="9" w15:restartNumberingAfterBreak="0">
     <w:nsid w:val="5478475E"/>
     <w:multiLevelType w:val="hybridMultilevel"/>
     <w:tmpl w:val="1592CB48"/>
@@ -1399,7 +2071,7 @@
       </w:pPr>
     </w:lvl>
   </w:abstractNum>
-  <w:abstractNum w:abstractNumId="8" w15:restartNumberingAfterBreak="0">
+  <w:abstractNum w:abstractNumId="10" w15:restartNumberingAfterBreak="0">
     <w:nsid w:val="5EC572F7"/>
     <w:multiLevelType w:val="hybridMultilevel"/>
     <w:tmpl w:val="6DA49942"/>
@@ -1611,7 +2283,7 @@
       </w:rPr>
     </w:lvl>
   </w:abstractNum>
-  <w:abstractNum w:abstractNumId="9" w15:restartNumberingAfterBreak="0">
+  <w:abstractNum w:abstractNumId="11" w15:restartNumberingAfterBreak="0">
     <w:nsid w:val="612D4A4B"/>
     <w:multiLevelType w:val="hybridMultilevel"/>
     <w:tmpl w:val="6FC8B398"/>
@@ -1724,7 +2396,7 @@
       </w:rPr>
     </w:lvl>
   </w:abstractNum>
-  <w:abstractNum w:abstractNumId="10" w15:restartNumberingAfterBreak="0">
+  <w:abstractNum w:abstractNumId="12" w15:restartNumberingAfterBreak="0">
     <w:nsid w:val="72964519"/>
     <w:multiLevelType w:val="hybridMultilevel"/>
     <w:tmpl w:val="10F0449C"/>
@@ -1814,37 +2486,43 @@
     </w:lvl>
   </w:abstractNum>
   <w:num w:numId="1" w16cid:durableId="460348908">
+    <w:abstractNumId w:val="10"/>
+  </w:num>
+  <w:num w:numId="2" w16cid:durableId="2099673166">
+    <w:abstractNumId w:val="2"/>
+  </w:num>
+  <w:num w:numId="3" w16cid:durableId="619915961">
+    <w:abstractNumId w:val="7"/>
+  </w:num>
+  <w:num w:numId="4" w16cid:durableId="208297615">
+    <w:abstractNumId w:val="3"/>
+  </w:num>
+  <w:num w:numId="5" w16cid:durableId="1609845655">
+    <w:abstractNumId w:val="6"/>
+  </w:num>
+  <w:num w:numId="6" w16cid:durableId="1158184249">
     <w:abstractNumId w:val="8"/>
   </w:num>
-  <w:num w:numId="2" w16cid:durableId="2099673166">
-    <w:abstractNumId w:val="1"/>
-  </w:num>
-  <w:num w:numId="3" w16cid:durableId="619915961">
+  <w:num w:numId="7" w16cid:durableId="580918180">
     <w:abstractNumId w:val="5"/>
   </w:num>
-  <w:num w:numId="4" w16cid:durableId="208297615">
-    <w:abstractNumId w:val="2"/>
-  </w:num>
-  <w:num w:numId="5" w16cid:durableId="1609845655">
-    <w:abstractNumId w:val="4"/>
-  </w:num>
-  <w:num w:numId="6" w16cid:durableId="1158184249">
-    <w:abstractNumId w:val="6"/>
-  </w:num>
-  <w:num w:numId="7" w16cid:durableId="580918180">
-    <w:abstractNumId w:val="3"/>
-  </w:num>
   <w:num w:numId="8" w16cid:durableId="1731490823">
-    <w:abstractNumId w:val="9"/>
+    <w:abstractNumId w:val="11"/>
   </w:num>
   <w:num w:numId="9" w16cid:durableId="1160341532">
     <w:abstractNumId w:val="0"/>
   </w:num>
   <w:num w:numId="10" w16cid:durableId="883296987">
-    <w:abstractNumId w:val="10"/>
+    <w:abstractNumId w:val="12"/>
   </w:num>
   <w:num w:numId="11" w16cid:durableId="19867106">
-    <w:abstractNumId w:val="7"/>
+    <w:abstractNumId w:val="9"/>
+  </w:num>
+  <w:num w:numId="12" w16cid:durableId="781263986">
+    <w:abstractNumId w:val="4"/>
+  </w:num>
+  <w:num w:numId="13" w16cid:durableId="261763198">
+    <w:abstractNumId w:val="1"/>
   </w:num>
 </w:numbering>
 </file>

</xml_diff>

<commit_message>
added screenshots to the docx file
</commit_message>
<xml_diff>
--- a/Big Data Tech assignment 1 part 1.docx
+++ b/Big Data Tech assignment 1 part 1.docx
@@ -1221,9 +1221,7 @@
         <w:tblW w:w="8992" w:type="dxa"/>
         <w:tblInd w:w="30" w:type="dxa"/>
         <w:tblCellMar>
-          <w:top w:w="0" w:type="dxa"/>
           <w:left w:w="106" w:type="dxa"/>
-          <w:bottom w:w="0" w:type="dxa"/>
           <w:right w:w="7" w:type="dxa"/>
         </w:tblCellMar>
         <w:tblLook w:val="04A0" w:firstRow="1" w:lastRow="0" w:firstColumn="1" w:lastColumn="0" w:noHBand="0" w:noVBand="1"/>
@@ -2319,10 +2317,8 @@
         <w:tblW w:w="8984" w:type="dxa"/>
         <w:tblInd w:w="38" w:type="dxa"/>
         <w:tblCellMar>
-          <w:top w:w="0" w:type="dxa"/>
           <w:left w:w="110" w:type="dxa"/>
           <w:bottom w:w="158" w:type="dxa"/>
-          <w:right w:w="0" w:type="dxa"/>
         </w:tblCellMar>
         <w:tblLook w:val="04A0" w:firstRow="1" w:lastRow="0" w:firstColumn="1" w:lastColumn="0" w:noHBand="0" w:noVBand="1"/>
       </w:tblPr>
@@ -2928,8 +2924,6 @@
         <w:tblCellMar>
           <w:top w:w="187" w:type="dxa"/>
           <w:left w:w="110" w:type="dxa"/>
-          <w:bottom w:w="0" w:type="dxa"/>
-          <w:right w:w="0" w:type="dxa"/>
         </w:tblCellMar>
         <w:tblLook w:val="04A0" w:firstRow="1" w:lastRow="0" w:firstColumn="1" w:lastColumn="0" w:noHBand="0" w:noVBand="1"/>
       </w:tblPr>
@@ -4836,7 +4830,7 @@
           <w:noProof/>
         </w:rPr>
         <w:drawing>
-          <wp:inline distT="0" distB="0" distL="0" distR="0" wp14:anchorId="7B93FA38" wp14:editId="76F3424F">
+          <wp:inline distT="0" distB="0" distL="0" distR="0" wp14:anchorId="7B93FA38" wp14:editId="73B17EA6">
             <wp:extent cx="5705475" cy="2476500"/>
             <wp:effectExtent l="0" t="0" r="0" b="0"/>
             <wp:docPr id="1461" name="Picture 1461"/>
@@ -4889,6 +4883,1805 @@
       </w:r>
     </w:p>
     <w:p/>
+    <w:p>
+      <w:pPr>
+        <w:pStyle w:val="ListParagraph"/>
+        <w:numPr>
+          <w:ilvl w:val="0"/>
+          <w:numId w:val="15"/>
+        </w:numPr>
+      </w:pPr>
+      <w:r>
+        <w:rPr>
+          <w:b/>
+          <w:bCs/>
+        </w:rPr>
+        <w:t>Query Results:</w:t>
+      </w:r>
+    </w:p>
+    <w:p>
+      <w:pPr>
+        <w:pStyle w:val="ListParagraph"/>
+        <w:numPr>
+          <w:ilvl w:val="1"/>
+          <w:numId w:val="15"/>
+        </w:numPr>
+        <w:rPr>
+          <w:b/>
+          <w:bCs/>
+        </w:rPr>
+      </w:pPr>
+      <w:r>
+        <w:rPr>
+          <w:b/>
+          <w:bCs/>
+        </w:rPr>
+        <w:t>SHOW TABLES</w:t>
+      </w:r>
+    </w:p>
+    <w:p>
+      <w:pPr>
+        <w:pStyle w:val="ListParagraph"/>
+        <w:ind w:left="737" w:firstLine="0"/>
+        <w:rPr>
+          <w:b/>
+          <w:bCs/>
+        </w:rPr>
+      </w:pPr>
+      <w:r>
+        <w:rPr>
+          <w:noProof/>
+        </w:rPr>
+        <w:drawing>
+          <wp:anchor distT="0" distB="0" distL="114300" distR="114300" simplePos="0" relativeHeight="251658240" behindDoc="1" locked="0" layoutInCell="1" allowOverlap="1" wp14:anchorId="7D348E14" wp14:editId="4801ECEC">
+            <wp:simplePos x="0" y="0"/>
+            <wp:positionH relativeFrom="column">
+              <wp:posOffset>1343025</wp:posOffset>
+            </wp:positionH>
+            <wp:positionV relativeFrom="paragraph">
+              <wp:posOffset>4445</wp:posOffset>
+            </wp:positionV>
+            <wp:extent cx="2788920" cy="2522220"/>
+            <wp:effectExtent l="0" t="0" r="0" b="0"/>
+            <wp:wrapNone/>
+            <wp:docPr id="877552555" name="Picture 3"/>
+            <wp:cNvGraphicFramePr>
+              <a:graphicFrameLocks xmlns:a="http://schemas.openxmlformats.org/drawingml/2006/main" noChangeAspect="1"/>
+            </wp:cNvGraphicFramePr>
+            <a:graphic xmlns:a="http://schemas.openxmlformats.org/drawingml/2006/main">
+              <a:graphicData uri="http://schemas.openxmlformats.org/drawingml/2006/picture">
+                <pic:pic xmlns:pic="http://schemas.openxmlformats.org/drawingml/2006/picture">
+                  <pic:nvPicPr>
+                    <pic:cNvPr id="0" name="Picture 5"/>
+                    <pic:cNvPicPr>
+                      <a:picLocks noChangeAspect="1" noChangeArrowheads="1"/>
+                    </pic:cNvPicPr>
+                  </pic:nvPicPr>
+                  <pic:blipFill>
+                    <a:blip r:embed="rId16" cstate="print">
+                      <a:extLst>
+                        <a:ext uri="{28A0092B-C50C-407E-A947-70E740481C1C}">
+                          <a14:useLocalDpi xmlns:a14="http://schemas.microsoft.com/office/drawing/2010/main" val="0"/>
+                        </a:ext>
+                      </a:extLst>
+                    </a:blip>
+                    <a:srcRect/>
+                    <a:stretch>
+                      <a:fillRect/>
+                    </a:stretch>
+                  </pic:blipFill>
+                  <pic:spPr bwMode="auto">
+                    <a:xfrm>
+                      <a:off x="0" y="0"/>
+                      <a:ext cx="2788920" cy="2522220"/>
+                    </a:xfrm>
+                    <a:prstGeom prst="rect">
+                      <a:avLst/>
+                    </a:prstGeom>
+                    <a:noFill/>
+                    <a:ln>
+                      <a:noFill/>
+                    </a:ln>
+                  </pic:spPr>
+                </pic:pic>
+              </a:graphicData>
+            </a:graphic>
+          </wp:anchor>
+        </w:drawing>
+      </w:r>
+    </w:p>
+    <w:p/>
+    <w:p/>
+    <w:p/>
+    <w:p/>
+    <w:p/>
+    <w:p/>
+    <w:p/>
+    <w:p/>
+    <w:p/>
+    <w:p/>
+    <w:p/>
+    <w:p/>
+    <w:p/>
+    <w:p>
+      <w:pPr>
+        <w:pStyle w:val="ListParagraph"/>
+        <w:numPr>
+          <w:ilvl w:val="1"/>
+          <w:numId w:val="15"/>
+        </w:numPr>
+      </w:pPr>
+      <w:r>
+        <w:rPr>
+          <w:noProof/>
+        </w:rPr>
+        <w:drawing>
+          <wp:anchor distT="0" distB="0" distL="114300" distR="114300" simplePos="0" relativeHeight="251659264" behindDoc="1" locked="0" layoutInCell="1" allowOverlap="1" wp14:anchorId="412A4CBE" wp14:editId="7B4CAFD1">
+            <wp:simplePos x="0" y="0"/>
+            <wp:positionH relativeFrom="page">
+              <wp:posOffset>1634490</wp:posOffset>
+            </wp:positionH>
+            <wp:positionV relativeFrom="paragraph">
+              <wp:posOffset>283845</wp:posOffset>
+            </wp:positionV>
+            <wp:extent cx="5657850" cy="2038350"/>
+            <wp:effectExtent l="0" t="0" r="0" b="0"/>
+            <wp:wrapTight wrapText="bothSides">
+              <wp:wrapPolygon edited="0">
+                <wp:start x="0" y="0"/>
+                <wp:lineTo x="0" y="21398"/>
+                <wp:lineTo x="21527" y="21398"/>
+                <wp:lineTo x="21527" y="0"/>
+                <wp:lineTo x="0" y="0"/>
+              </wp:wrapPolygon>
+            </wp:wrapTight>
+            <wp:docPr id="1206095572" name="Picture 4"/>
+            <wp:cNvGraphicFramePr>
+              <a:graphicFrameLocks xmlns:a="http://schemas.openxmlformats.org/drawingml/2006/main" noChangeAspect="1"/>
+            </wp:cNvGraphicFramePr>
+            <a:graphic xmlns:a="http://schemas.openxmlformats.org/drawingml/2006/main">
+              <a:graphicData uri="http://schemas.openxmlformats.org/drawingml/2006/picture">
+                <pic:pic xmlns:pic="http://schemas.openxmlformats.org/drawingml/2006/picture">
+                  <pic:nvPicPr>
+                    <pic:cNvPr id="0" name="Picture 6"/>
+                    <pic:cNvPicPr>
+                      <a:picLocks noChangeAspect="1" noChangeArrowheads="1"/>
+                    </pic:cNvPicPr>
+                  </pic:nvPicPr>
+                  <pic:blipFill>
+                    <a:blip r:embed="rId17" cstate="print">
+                      <a:extLst>
+                        <a:ext uri="{28A0092B-C50C-407E-A947-70E740481C1C}">
+                          <a14:useLocalDpi xmlns:a14="http://schemas.microsoft.com/office/drawing/2010/main" val="0"/>
+                        </a:ext>
+                      </a:extLst>
+                    </a:blip>
+                    <a:srcRect/>
+                    <a:stretch>
+                      <a:fillRect/>
+                    </a:stretch>
+                  </pic:blipFill>
+                  <pic:spPr bwMode="auto">
+                    <a:xfrm>
+                      <a:off x="0" y="0"/>
+                      <a:ext cx="5657850" cy="2038350"/>
+                    </a:xfrm>
+                    <a:prstGeom prst="rect">
+                      <a:avLst/>
+                    </a:prstGeom>
+                    <a:noFill/>
+                    <a:ln>
+                      <a:noFill/>
+                    </a:ln>
+                  </pic:spPr>
+                </pic:pic>
+              </a:graphicData>
+            </a:graphic>
+          </wp:anchor>
+        </w:drawing>
+      </w:r>
+      <w:r>
+        <w:rPr>
+          <w:b/>
+          <w:bCs/>
+        </w:rPr>
+        <w:t>DESCRIBE TRIP</w:t>
+      </w:r>
+    </w:p>
+    <w:p>
+      <w:pPr>
+        <w:pStyle w:val="ListParagraph"/>
+        <w:ind w:left="1821" w:firstLine="0"/>
+      </w:pPr>
+    </w:p>
+    <w:p>
+      <w:pPr>
+        <w:pStyle w:val="ListParagraph"/>
+        <w:numPr>
+          <w:ilvl w:val="1"/>
+          <w:numId w:val="15"/>
+        </w:numPr>
+        <w:rPr>
+          <w:b/>
+          <w:bCs/>
+        </w:rPr>
+      </w:pPr>
+      <w:r>
+        <w:rPr>
+          <w:b/>
+          <w:bCs/>
+          <w:noProof/>
+        </w:rPr>
+        <w:drawing>
+          <wp:anchor distT="0" distB="0" distL="114300" distR="114300" simplePos="0" relativeHeight="251660288" behindDoc="1" locked="0" layoutInCell="1" allowOverlap="1" wp14:anchorId="41A877C1" wp14:editId="5180901A">
+            <wp:simplePos x="0" y="0"/>
+            <wp:positionH relativeFrom="margin">
+              <wp:align>right</wp:align>
+            </wp:positionH>
+            <wp:positionV relativeFrom="paragraph">
+              <wp:posOffset>251460</wp:posOffset>
+            </wp:positionV>
+            <wp:extent cx="5474970" cy="2914650"/>
+            <wp:effectExtent l="0" t="0" r="0" b="0"/>
+            <wp:wrapNone/>
+            <wp:docPr id="689032215" name="Picture 7"/>
+            <wp:cNvGraphicFramePr>
+              <a:graphicFrameLocks xmlns:a="http://schemas.openxmlformats.org/drawingml/2006/main" noChangeAspect="1"/>
+            </wp:cNvGraphicFramePr>
+            <a:graphic xmlns:a="http://schemas.openxmlformats.org/drawingml/2006/main">
+              <a:graphicData uri="http://schemas.openxmlformats.org/drawingml/2006/picture">
+                <pic:pic xmlns:pic="http://schemas.openxmlformats.org/drawingml/2006/picture">
+                  <pic:nvPicPr>
+                    <pic:cNvPr id="0" name="Picture 9"/>
+                    <pic:cNvPicPr>
+                      <a:picLocks noChangeAspect="1" noChangeArrowheads="1"/>
+                    </pic:cNvPicPr>
+                  </pic:nvPicPr>
+                  <pic:blipFill>
+                    <a:blip r:embed="rId18" cstate="print">
+                      <a:extLst>
+                        <a:ext uri="{28A0092B-C50C-407E-A947-70E740481C1C}">
+                          <a14:useLocalDpi xmlns:a14="http://schemas.microsoft.com/office/drawing/2010/main" val="0"/>
+                        </a:ext>
+                      </a:extLst>
+                    </a:blip>
+                    <a:srcRect/>
+                    <a:stretch>
+                      <a:fillRect/>
+                    </a:stretch>
+                  </pic:blipFill>
+                  <pic:spPr bwMode="auto">
+                    <a:xfrm>
+                      <a:off x="0" y="0"/>
+                      <a:ext cx="5474970" cy="2914650"/>
+                    </a:xfrm>
+                    <a:prstGeom prst="rect">
+                      <a:avLst/>
+                    </a:prstGeom>
+                    <a:noFill/>
+                    <a:ln>
+                      <a:noFill/>
+                    </a:ln>
+                  </pic:spPr>
+                </pic:pic>
+              </a:graphicData>
+            </a:graphic>
+          </wp:anchor>
+        </w:drawing>
+      </w:r>
+      <w:r>
+        <w:rPr>
+          <w:b/>
+          <w:bCs/>
+        </w:rPr>
+        <w:t>DESCRIBE PAYMENT</w:t>
+      </w:r>
+    </w:p>
+    <w:p>
+      <w:pPr>
+        <w:pStyle w:val="ListParagraph"/>
+        <w:rPr>
+          <w:b/>
+          <w:bCs/>
+        </w:rPr>
+      </w:pPr>
+    </w:p>
+    <w:p>
+      <w:pPr>
+        <w:rPr>
+          <w:b/>
+          <w:bCs/>
+        </w:rPr>
+      </w:pPr>
+    </w:p>
+    <w:p>
+      <w:pPr>
+        <w:rPr>
+          <w:b/>
+          <w:bCs/>
+        </w:rPr>
+      </w:pPr>
+    </w:p>
+    <w:p>
+      <w:pPr>
+        <w:rPr>
+          <w:b/>
+          <w:bCs/>
+        </w:rPr>
+      </w:pPr>
+    </w:p>
+    <w:p>
+      <w:pPr>
+        <w:rPr>
+          <w:b/>
+          <w:bCs/>
+        </w:rPr>
+      </w:pPr>
+    </w:p>
+    <w:p>
+      <w:pPr>
+        <w:rPr>
+          <w:b/>
+          <w:bCs/>
+        </w:rPr>
+      </w:pPr>
+    </w:p>
+    <w:p>
+      <w:pPr>
+        <w:rPr>
+          <w:b/>
+          <w:bCs/>
+        </w:rPr>
+      </w:pPr>
+    </w:p>
+    <w:p>
+      <w:pPr>
+        <w:rPr>
+          <w:b/>
+          <w:bCs/>
+        </w:rPr>
+      </w:pPr>
+    </w:p>
+    <w:p>
+      <w:pPr>
+        <w:rPr>
+          <w:b/>
+          <w:bCs/>
+        </w:rPr>
+      </w:pPr>
+    </w:p>
+    <w:p>
+      <w:pPr>
+        <w:rPr>
+          <w:b/>
+          <w:bCs/>
+        </w:rPr>
+      </w:pPr>
+    </w:p>
+    <w:p>
+      <w:pPr>
+        <w:rPr>
+          <w:b/>
+          <w:bCs/>
+        </w:rPr>
+      </w:pPr>
+    </w:p>
+    <w:p>
+      <w:pPr>
+        <w:rPr>
+          <w:b/>
+          <w:bCs/>
+        </w:rPr>
+      </w:pPr>
+    </w:p>
+    <w:p>
+      <w:pPr>
+        <w:rPr>
+          <w:b/>
+          <w:bCs/>
+        </w:rPr>
+      </w:pPr>
+    </w:p>
+    <w:p>
+      <w:pPr>
+        <w:rPr>
+          <w:b/>
+          <w:bCs/>
+        </w:rPr>
+      </w:pPr>
+    </w:p>
+    <w:p>
+      <w:pPr>
+        <w:rPr>
+          <w:b/>
+          <w:bCs/>
+        </w:rPr>
+      </w:pPr>
+    </w:p>
+    <w:p>
+      <w:pPr>
+        <w:rPr>
+          <w:b/>
+          <w:bCs/>
+        </w:rPr>
+      </w:pPr>
+    </w:p>
+    <w:p>
+      <w:pPr>
+        <w:rPr>
+          <w:b/>
+          <w:bCs/>
+        </w:rPr>
+      </w:pPr>
+    </w:p>
+    <w:p>
+      <w:pPr>
+        <w:pStyle w:val="ListParagraph"/>
+        <w:numPr>
+          <w:ilvl w:val="1"/>
+          <w:numId w:val="15"/>
+        </w:numPr>
+        <w:rPr>
+          <w:b/>
+          <w:bCs/>
+        </w:rPr>
+      </w:pPr>
+      <w:r>
+        <w:rPr>
+          <w:b/>
+          <w:bCs/>
+          <w:noProof/>
+        </w:rPr>
+        <w:drawing>
+          <wp:anchor distT="0" distB="0" distL="114300" distR="114300" simplePos="0" relativeHeight="251661312" behindDoc="1" locked="0" layoutInCell="1" allowOverlap="1" wp14:anchorId="64110F36" wp14:editId="173BF93A">
+            <wp:simplePos x="0" y="0"/>
+            <wp:positionH relativeFrom="column">
+              <wp:posOffset>346075</wp:posOffset>
+            </wp:positionH>
+            <wp:positionV relativeFrom="paragraph">
+              <wp:posOffset>272415</wp:posOffset>
+            </wp:positionV>
+            <wp:extent cx="5690405" cy="1565910"/>
+            <wp:effectExtent l="0" t="0" r="5715" b="0"/>
+            <wp:wrapNone/>
+            <wp:docPr id="445456381" name="Picture 8"/>
+            <wp:cNvGraphicFramePr>
+              <a:graphicFrameLocks xmlns:a="http://schemas.openxmlformats.org/drawingml/2006/main" noChangeAspect="1"/>
+            </wp:cNvGraphicFramePr>
+            <a:graphic xmlns:a="http://schemas.openxmlformats.org/drawingml/2006/main">
+              <a:graphicData uri="http://schemas.openxmlformats.org/drawingml/2006/picture">
+                <pic:pic xmlns:pic="http://schemas.openxmlformats.org/drawingml/2006/picture">
+                  <pic:nvPicPr>
+                    <pic:cNvPr id="0" name="Picture 10"/>
+                    <pic:cNvPicPr>
+                      <a:picLocks noChangeAspect="1" noChangeArrowheads="1"/>
+                    </pic:cNvPicPr>
+                  </pic:nvPicPr>
+                  <pic:blipFill>
+                    <a:blip r:embed="rId19" cstate="print">
+                      <a:extLst>
+                        <a:ext uri="{28A0092B-C50C-407E-A947-70E740481C1C}">
+                          <a14:useLocalDpi xmlns:a14="http://schemas.microsoft.com/office/drawing/2010/main" val="0"/>
+                        </a:ext>
+                      </a:extLst>
+                    </a:blip>
+                    <a:srcRect/>
+                    <a:stretch>
+                      <a:fillRect/>
+                    </a:stretch>
+                  </pic:blipFill>
+                  <pic:spPr bwMode="auto">
+                    <a:xfrm>
+                      <a:off x="0" y="0"/>
+                      <a:ext cx="5690405" cy="1565910"/>
+                    </a:xfrm>
+                    <a:prstGeom prst="rect">
+                      <a:avLst/>
+                    </a:prstGeom>
+                    <a:noFill/>
+                    <a:ln>
+                      <a:noFill/>
+                    </a:ln>
+                  </pic:spPr>
+                </pic:pic>
+              </a:graphicData>
+            </a:graphic>
+            <wp14:sizeRelH relativeFrom="margin">
+              <wp14:pctWidth>0</wp14:pctWidth>
+            </wp14:sizeRelH>
+            <wp14:sizeRelV relativeFrom="margin">
+              <wp14:pctHeight>0</wp14:pctHeight>
+            </wp14:sizeRelV>
+          </wp:anchor>
+        </w:drawing>
+      </w:r>
+      <w:r>
+        <w:rPr>
+          <w:b/>
+          <w:bCs/>
+        </w:rPr>
+        <w:t>SELECT* FROM TRIP LIMIT 5;</w:t>
+      </w:r>
+    </w:p>
+    <w:p>
+      <w:pPr>
+        <w:rPr>
+          <w:b/>
+          <w:bCs/>
+        </w:rPr>
+      </w:pPr>
+    </w:p>
+    <w:p>
+      <w:pPr>
+        <w:rPr>
+          <w:b/>
+          <w:bCs/>
+        </w:rPr>
+      </w:pPr>
+    </w:p>
+    <w:p>
+      <w:pPr>
+        <w:rPr>
+          <w:b/>
+          <w:bCs/>
+        </w:rPr>
+      </w:pPr>
+    </w:p>
+    <w:p>
+      <w:pPr>
+        <w:rPr>
+          <w:b/>
+          <w:bCs/>
+        </w:rPr>
+      </w:pPr>
+    </w:p>
+    <w:p>
+      <w:pPr>
+        <w:rPr>
+          <w:b/>
+          <w:bCs/>
+        </w:rPr>
+      </w:pPr>
+    </w:p>
+    <w:p>
+      <w:pPr>
+        <w:rPr>
+          <w:b/>
+          <w:bCs/>
+        </w:rPr>
+      </w:pPr>
+    </w:p>
+    <w:p>
+      <w:pPr>
+        <w:rPr>
+          <w:b/>
+          <w:bCs/>
+        </w:rPr>
+      </w:pPr>
+    </w:p>
+    <w:p>
+      <w:pPr>
+        <w:rPr>
+          <w:b/>
+          <w:bCs/>
+        </w:rPr>
+      </w:pPr>
+    </w:p>
+    <w:p>
+      <w:pPr>
+        <w:rPr>
+          <w:b/>
+          <w:bCs/>
+        </w:rPr>
+      </w:pPr>
+    </w:p>
+    <w:p>
+      <w:pPr>
+        <w:rPr>
+          <w:b/>
+          <w:bCs/>
+        </w:rPr>
+      </w:pPr>
+    </w:p>
+    <w:p>
+      <w:pPr>
+        <w:rPr>
+          <w:b/>
+          <w:bCs/>
+        </w:rPr>
+      </w:pPr>
+    </w:p>
+    <w:p>
+      <w:pPr>
+        <w:pStyle w:val="ListParagraph"/>
+        <w:numPr>
+          <w:ilvl w:val="1"/>
+          <w:numId w:val="15"/>
+        </w:numPr>
+        <w:rPr>
+          <w:b/>
+          <w:bCs/>
+        </w:rPr>
+      </w:pPr>
+      <w:r>
+        <w:rPr>
+          <w:b/>
+          <w:bCs/>
+          <w:noProof/>
+        </w:rPr>
+        <w:drawing>
+          <wp:anchor distT="0" distB="0" distL="114300" distR="114300" simplePos="0" relativeHeight="251662336" behindDoc="1" locked="0" layoutInCell="1" allowOverlap="1" wp14:anchorId="42058998" wp14:editId="15573556">
+            <wp:simplePos x="0" y="0"/>
+            <wp:positionH relativeFrom="column">
+              <wp:posOffset>565785</wp:posOffset>
+            </wp:positionH>
+            <wp:positionV relativeFrom="paragraph">
+              <wp:posOffset>248285</wp:posOffset>
+            </wp:positionV>
+            <wp:extent cx="4903470" cy="3162300"/>
+            <wp:effectExtent l="0" t="0" r="0" b="0"/>
+            <wp:wrapNone/>
+            <wp:docPr id="1230352216" name="Picture 9"/>
+            <wp:cNvGraphicFramePr>
+              <a:graphicFrameLocks xmlns:a="http://schemas.openxmlformats.org/drawingml/2006/main" noChangeAspect="1"/>
+            </wp:cNvGraphicFramePr>
+            <a:graphic xmlns:a="http://schemas.openxmlformats.org/drawingml/2006/main">
+              <a:graphicData uri="http://schemas.openxmlformats.org/drawingml/2006/picture">
+                <pic:pic xmlns:pic="http://schemas.openxmlformats.org/drawingml/2006/picture">
+                  <pic:nvPicPr>
+                    <pic:cNvPr id="0" name="Picture 11"/>
+                    <pic:cNvPicPr>
+                      <a:picLocks noChangeAspect="1" noChangeArrowheads="1"/>
+                    </pic:cNvPicPr>
+                  </pic:nvPicPr>
+                  <pic:blipFill>
+                    <a:blip r:embed="rId20" cstate="print">
+                      <a:extLst>
+                        <a:ext uri="{28A0092B-C50C-407E-A947-70E740481C1C}">
+                          <a14:useLocalDpi xmlns:a14="http://schemas.microsoft.com/office/drawing/2010/main" val="0"/>
+                        </a:ext>
+                      </a:extLst>
+                    </a:blip>
+                    <a:srcRect/>
+                    <a:stretch>
+                      <a:fillRect/>
+                    </a:stretch>
+                  </pic:blipFill>
+                  <pic:spPr bwMode="auto">
+                    <a:xfrm>
+                      <a:off x="0" y="0"/>
+                      <a:ext cx="4903470" cy="3162300"/>
+                    </a:xfrm>
+                    <a:prstGeom prst="rect">
+                      <a:avLst/>
+                    </a:prstGeom>
+                    <a:noFill/>
+                    <a:ln>
+                      <a:noFill/>
+                    </a:ln>
+                  </pic:spPr>
+                </pic:pic>
+              </a:graphicData>
+            </a:graphic>
+          </wp:anchor>
+        </w:drawing>
+      </w:r>
+      <w:r>
+        <w:rPr>
+          <w:b/>
+          <w:bCs/>
+        </w:rPr>
+        <w:t>Row Counts:</w:t>
+      </w:r>
+    </w:p>
+    <w:p>
+      <w:pPr>
+        <w:rPr>
+          <w:b/>
+          <w:bCs/>
+        </w:rPr>
+      </w:pPr>
+    </w:p>
+    <w:p>
+      <w:pPr>
+        <w:rPr>
+          <w:b/>
+          <w:bCs/>
+        </w:rPr>
+      </w:pPr>
+    </w:p>
+    <w:p>
+      <w:pPr>
+        <w:rPr>
+          <w:b/>
+          <w:bCs/>
+        </w:rPr>
+      </w:pPr>
+    </w:p>
+    <w:p>
+      <w:pPr>
+        <w:rPr>
+          <w:b/>
+          <w:bCs/>
+        </w:rPr>
+      </w:pPr>
+    </w:p>
+    <w:p>
+      <w:pPr>
+        <w:rPr>
+          <w:b/>
+          <w:bCs/>
+        </w:rPr>
+      </w:pPr>
+    </w:p>
+    <w:p>
+      <w:pPr>
+        <w:rPr>
+          <w:b/>
+          <w:bCs/>
+        </w:rPr>
+      </w:pPr>
+    </w:p>
+    <w:p>
+      <w:pPr>
+        <w:rPr>
+          <w:b/>
+          <w:bCs/>
+        </w:rPr>
+      </w:pPr>
+    </w:p>
+    <w:p>
+      <w:pPr>
+        <w:rPr>
+          <w:b/>
+          <w:bCs/>
+        </w:rPr>
+      </w:pPr>
+    </w:p>
+    <w:p>
+      <w:pPr>
+        <w:rPr>
+          <w:b/>
+          <w:bCs/>
+        </w:rPr>
+      </w:pPr>
+    </w:p>
+    <w:p>
+      <w:pPr>
+        <w:rPr>
+          <w:b/>
+          <w:bCs/>
+        </w:rPr>
+      </w:pPr>
+    </w:p>
+    <w:p>
+      <w:pPr>
+        <w:rPr>
+          <w:b/>
+          <w:bCs/>
+        </w:rPr>
+      </w:pPr>
+    </w:p>
+    <w:p>
+      <w:pPr>
+        <w:rPr>
+          <w:b/>
+          <w:bCs/>
+        </w:rPr>
+      </w:pPr>
+    </w:p>
+    <w:p>
+      <w:pPr>
+        <w:rPr>
+          <w:b/>
+          <w:bCs/>
+        </w:rPr>
+      </w:pPr>
+    </w:p>
+    <w:p>
+      <w:pPr>
+        <w:rPr>
+          <w:b/>
+          <w:bCs/>
+        </w:rPr>
+      </w:pPr>
+    </w:p>
+    <w:p>
+      <w:pPr>
+        <w:pStyle w:val="ListParagraph"/>
+        <w:numPr>
+          <w:ilvl w:val="1"/>
+          <w:numId w:val="15"/>
+        </w:numPr>
+        <w:rPr>
+          <w:b/>
+          <w:bCs/>
+        </w:rPr>
+      </w:pPr>
+      <w:r>
+        <w:rPr>
+          <w:noProof/>
+        </w:rPr>
+        <w:drawing>
+          <wp:anchor distT="0" distB="0" distL="114300" distR="114300" simplePos="0" relativeHeight="251663360" behindDoc="1" locked="0" layoutInCell="1" allowOverlap="1" wp14:anchorId="396AC7BB" wp14:editId="40BBE744">
+            <wp:simplePos x="0" y="0"/>
+            <wp:positionH relativeFrom="column">
+              <wp:posOffset>987002</wp:posOffset>
+            </wp:positionH>
+            <wp:positionV relativeFrom="paragraph">
+              <wp:posOffset>419100</wp:posOffset>
+            </wp:positionV>
+            <wp:extent cx="4857750" cy="6438900"/>
+            <wp:effectExtent l="0" t="0" r="0" b="0"/>
+            <wp:wrapNone/>
+            <wp:docPr id="1280625718" name="Picture 10"/>
+            <wp:cNvGraphicFramePr>
+              <a:graphicFrameLocks xmlns:a="http://schemas.openxmlformats.org/drawingml/2006/main" noChangeAspect="1"/>
+            </wp:cNvGraphicFramePr>
+            <a:graphic xmlns:a="http://schemas.openxmlformats.org/drawingml/2006/main">
+              <a:graphicData uri="http://schemas.openxmlformats.org/drawingml/2006/picture">
+                <pic:pic xmlns:pic="http://schemas.openxmlformats.org/drawingml/2006/picture">
+                  <pic:nvPicPr>
+                    <pic:cNvPr id="0" name="Picture 12"/>
+                    <pic:cNvPicPr>
+                      <a:picLocks noChangeAspect="1" noChangeArrowheads="1"/>
+                    </pic:cNvPicPr>
+                  </pic:nvPicPr>
+                  <pic:blipFill>
+                    <a:blip r:embed="rId21" cstate="print">
+                      <a:extLst>
+                        <a:ext uri="{28A0092B-C50C-407E-A947-70E740481C1C}">
+                          <a14:useLocalDpi xmlns:a14="http://schemas.microsoft.com/office/drawing/2010/main" val="0"/>
+                        </a:ext>
+                      </a:extLst>
+                    </a:blip>
+                    <a:srcRect/>
+                    <a:stretch>
+                      <a:fillRect/>
+                    </a:stretch>
+                  </pic:blipFill>
+                  <pic:spPr bwMode="auto">
+                    <a:xfrm>
+                      <a:off x="0" y="0"/>
+                      <a:ext cx="4857750" cy="6438900"/>
+                    </a:xfrm>
+                    <a:prstGeom prst="rect">
+                      <a:avLst/>
+                    </a:prstGeom>
+                    <a:noFill/>
+                    <a:ln>
+                      <a:noFill/>
+                    </a:ln>
+                  </pic:spPr>
+                </pic:pic>
+              </a:graphicData>
+            </a:graphic>
+          </wp:anchor>
+        </w:drawing>
+      </w:r>
+      <w:r>
+        <w:rPr>
+          <w:b/>
+          <w:bCs/>
+        </w:rPr>
+        <w:t>source verification_queries.sql</w:t>
+      </w:r>
+    </w:p>
+    <w:p>
+      <w:pPr>
+        <w:rPr>
+          <w:b/>
+          <w:bCs/>
+        </w:rPr>
+      </w:pPr>
+    </w:p>
+    <w:p>
+      <w:pPr>
+        <w:rPr>
+          <w:b/>
+          <w:bCs/>
+        </w:rPr>
+      </w:pPr>
+    </w:p>
+    <w:p>
+      <w:pPr>
+        <w:rPr>
+          <w:b/>
+          <w:bCs/>
+        </w:rPr>
+      </w:pPr>
+    </w:p>
+    <w:p>
+      <w:pPr>
+        <w:rPr>
+          <w:b/>
+          <w:bCs/>
+        </w:rPr>
+      </w:pPr>
+    </w:p>
+    <w:p>
+      <w:pPr>
+        <w:rPr>
+          <w:b/>
+          <w:bCs/>
+        </w:rPr>
+      </w:pPr>
+    </w:p>
+    <w:p>
+      <w:pPr>
+        <w:rPr>
+          <w:b/>
+          <w:bCs/>
+        </w:rPr>
+      </w:pPr>
+    </w:p>
+    <w:p>
+      <w:pPr>
+        <w:rPr>
+          <w:b/>
+          <w:bCs/>
+        </w:rPr>
+      </w:pPr>
+    </w:p>
+    <w:p>
+      <w:pPr>
+        <w:rPr>
+          <w:b/>
+          <w:bCs/>
+        </w:rPr>
+      </w:pPr>
+    </w:p>
+    <w:p>
+      <w:pPr>
+        <w:rPr>
+          <w:b/>
+          <w:bCs/>
+        </w:rPr>
+      </w:pPr>
+    </w:p>
+    <w:p>
+      <w:pPr>
+        <w:rPr>
+          <w:b/>
+          <w:bCs/>
+        </w:rPr>
+      </w:pPr>
+    </w:p>
+    <w:p>
+      <w:pPr>
+        <w:rPr>
+          <w:b/>
+          <w:bCs/>
+        </w:rPr>
+      </w:pPr>
+    </w:p>
+    <w:p>
+      <w:pPr>
+        <w:rPr>
+          <w:b/>
+          <w:bCs/>
+        </w:rPr>
+      </w:pPr>
+    </w:p>
+    <w:p>
+      <w:pPr>
+        <w:rPr>
+          <w:b/>
+          <w:bCs/>
+        </w:rPr>
+      </w:pPr>
+    </w:p>
+    <w:p>
+      <w:pPr>
+        <w:rPr>
+          <w:b/>
+          <w:bCs/>
+        </w:rPr>
+      </w:pPr>
+    </w:p>
+    <w:p>
+      <w:pPr>
+        <w:rPr>
+          <w:b/>
+          <w:bCs/>
+        </w:rPr>
+      </w:pPr>
+    </w:p>
+    <w:p>
+      <w:pPr>
+        <w:rPr>
+          <w:b/>
+          <w:bCs/>
+        </w:rPr>
+      </w:pPr>
+    </w:p>
+    <w:p>
+      <w:pPr>
+        <w:rPr>
+          <w:b/>
+          <w:bCs/>
+        </w:rPr>
+      </w:pPr>
+    </w:p>
+    <w:p>
+      <w:pPr>
+        <w:rPr>
+          <w:b/>
+          <w:bCs/>
+        </w:rPr>
+      </w:pPr>
+    </w:p>
+    <w:p>
+      <w:pPr>
+        <w:rPr>
+          <w:b/>
+          <w:bCs/>
+        </w:rPr>
+      </w:pPr>
+    </w:p>
+    <w:p>
+      <w:pPr>
+        <w:rPr>
+          <w:b/>
+          <w:bCs/>
+        </w:rPr>
+      </w:pPr>
+    </w:p>
+    <w:p>
+      <w:pPr>
+        <w:rPr>
+          <w:b/>
+          <w:bCs/>
+        </w:rPr>
+      </w:pPr>
+    </w:p>
+    <w:p>
+      <w:pPr>
+        <w:rPr>
+          <w:b/>
+          <w:bCs/>
+        </w:rPr>
+      </w:pPr>
+    </w:p>
+    <w:p>
+      <w:pPr>
+        <w:rPr>
+          <w:b/>
+          <w:bCs/>
+        </w:rPr>
+      </w:pPr>
+    </w:p>
+    <w:p>
+      <w:pPr>
+        <w:rPr>
+          <w:b/>
+          <w:bCs/>
+        </w:rPr>
+      </w:pPr>
+    </w:p>
+    <w:p>
+      <w:pPr>
+        <w:rPr>
+          <w:b/>
+          <w:bCs/>
+        </w:rPr>
+      </w:pPr>
+    </w:p>
+    <w:p>
+      <w:pPr>
+        <w:rPr>
+          <w:b/>
+          <w:bCs/>
+        </w:rPr>
+      </w:pPr>
+    </w:p>
+    <w:p>
+      <w:pPr>
+        <w:rPr>
+          <w:b/>
+          <w:bCs/>
+        </w:rPr>
+      </w:pPr>
+    </w:p>
+    <w:p>
+      <w:pPr>
+        <w:rPr>
+          <w:b/>
+          <w:bCs/>
+        </w:rPr>
+      </w:pPr>
+    </w:p>
+    <w:p>
+      <w:pPr>
+        <w:rPr>
+          <w:b/>
+          <w:bCs/>
+        </w:rPr>
+      </w:pPr>
+    </w:p>
+    <w:p>
+      <w:pPr>
+        <w:rPr>
+          <w:b/>
+          <w:bCs/>
+        </w:rPr>
+      </w:pPr>
+    </w:p>
+    <w:p>
+      <w:pPr>
+        <w:rPr>
+          <w:b/>
+          <w:bCs/>
+        </w:rPr>
+      </w:pPr>
+    </w:p>
+    <w:p>
+      <w:pPr>
+        <w:rPr>
+          <w:b/>
+          <w:bCs/>
+        </w:rPr>
+      </w:pPr>
+    </w:p>
+    <w:p>
+      <w:pPr>
+        <w:rPr>
+          <w:b/>
+          <w:bCs/>
+        </w:rPr>
+      </w:pPr>
+    </w:p>
+    <w:p>
+      <w:pPr>
+        <w:rPr>
+          <w:b/>
+          <w:bCs/>
+        </w:rPr>
+      </w:pPr>
+    </w:p>
+    <w:p>
+      <w:pPr>
+        <w:rPr>
+          <w:b/>
+          <w:bCs/>
+        </w:rPr>
+      </w:pPr>
+    </w:p>
+    <w:p>
+      <w:pPr>
+        <w:rPr>
+          <w:b/>
+          <w:bCs/>
+        </w:rPr>
+      </w:pPr>
+    </w:p>
+    <w:p>
+      <w:pPr>
+        <w:rPr>
+          <w:b/>
+          <w:bCs/>
+        </w:rPr>
+      </w:pPr>
+    </w:p>
+    <w:p>
+      <w:pPr>
+        <w:rPr>
+          <w:b/>
+          <w:bCs/>
+        </w:rPr>
+      </w:pPr>
+    </w:p>
+    <w:p>
+      <w:pPr>
+        <w:rPr>
+          <w:b/>
+          <w:bCs/>
+        </w:rPr>
+      </w:pPr>
+    </w:p>
+    <w:p>
+      <w:pPr>
+        <w:rPr>
+          <w:b/>
+          <w:bCs/>
+        </w:rPr>
+      </w:pPr>
+    </w:p>
+    <w:p>
+      <w:pPr>
+        <w:rPr>
+          <w:b/>
+          <w:bCs/>
+        </w:rPr>
+      </w:pPr>
+    </w:p>
+    <w:p>
+      <w:pPr>
+        <w:rPr>
+          <w:b/>
+          <w:bCs/>
+        </w:rPr>
+      </w:pPr>
+    </w:p>
+    <w:p>
+      <w:pPr>
+        <w:rPr>
+          <w:b/>
+          <w:bCs/>
+        </w:rPr>
+      </w:pPr>
+    </w:p>
+    <w:p>
+      <w:pPr>
+        <w:rPr>
+          <w:b/>
+          <w:bCs/>
+        </w:rPr>
+      </w:pPr>
+    </w:p>
+    <w:p>
+      <w:pPr>
+        <w:rPr>
+          <w:b/>
+          <w:bCs/>
+        </w:rPr>
+      </w:pPr>
+      <w:r>
+        <w:rPr>
+          <w:b/>
+          <w:bCs/>
+          <w:noProof/>
+        </w:rPr>
+        <w:drawing>
+          <wp:anchor distT="0" distB="0" distL="114300" distR="114300" simplePos="0" relativeHeight="251664384" behindDoc="1" locked="0" layoutInCell="1" allowOverlap="1" wp14:anchorId="5265FB25" wp14:editId="2CCE2476">
+            <wp:simplePos x="0" y="0"/>
+            <wp:positionH relativeFrom="margin">
+              <wp:align>center</wp:align>
+            </wp:positionH>
+            <wp:positionV relativeFrom="paragraph">
+              <wp:posOffset>-364490</wp:posOffset>
+            </wp:positionV>
+            <wp:extent cx="3907155" cy="4465955"/>
+            <wp:effectExtent l="0" t="0" r="0" b="0"/>
+            <wp:wrapNone/>
+            <wp:docPr id="149707580" name="Picture 11"/>
+            <wp:cNvGraphicFramePr>
+              <a:graphicFrameLocks xmlns:a="http://schemas.openxmlformats.org/drawingml/2006/main" noChangeAspect="1"/>
+            </wp:cNvGraphicFramePr>
+            <a:graphic xmlns:a="http://schemas.openxmlformats.org/drawingml/2006/main">
+              <a:graphicData uri="http://schemas.openxmlformats.org/drawingml/2006/picture">
+                <pic:pic xmlns:pic="http://schemas.openxmlformats.org/drawingml/2006/picture">
+                  <pic:nvPicPr>
+                    <pic:cNvPr id="0" name="Picture 13"/>
+                    <pic:cNvPicPr>
+                      <a:picLocks noChangeAspect="1" noChangeArrowheads="1"/>
+                    </pic:cNvPicPr>
+                  </pic:nvPicPr>
+                  <pic:blipFill>
+                    <a:blip r:embed="rId22" cstate="print">
+                      <a:extLst>
+                        <a:ext uri="{28A0092B-C50C-407E-A947-70E740481C1C}">
+                          <a14:useLocalDpi xmlns:a14="http://schemas.microsoft.com/office/drawing/2010/main" val="0"/>
+                        </a:ext>
+                      </a:extLst>
+                    </a:blip>
+                    <a:srcRect/>
+                    <a:stretch>
+                      <a:fillRect/>
+                    </a:stretch>
+                  </pic:blipFill>
+                  <pic:spPr bwMode="auto">
+                    <a:xfrm>
+                      <a:off x="0" y="0"/>
+                      <a:ext cx="3907155" cy="4465955"/>
+                    </a:xfrm>
+                    <a:prstGeom prst="rect">
+                      <a:avLst/>
+                    </a:prstGeom>
+                    <a:noFill/>
+                    <a:ln>
+                      <a:noFill/>
+                    </a:ln>
+                  </pic:spPr>
+                </pic:pic>
+              </a:graphicData>
+            </a:graphic>
+          </wp:anchor>
+        </w:drawing>
+      </w:r>
+    </w:p>
+    <w:p>
+      <w:pPr>
+        <w:rPr>
+          <w:b/>
+          <w:bCs/>
+        </w:rPr>
+      </w:pPr>
+    </w:p>
+    <w:p>
+      <w:pPr>
+        <w:rPr>
+          <w:b/>
+          <w:bCs/>
+        </w:rPr>
+      </w:pPr>
+    </w:p>
+    <w:p>
+      <w:pPr>
+        <w:rPr>
+          <w:b/>
+          <w:bCs/>
+        </w:rPr>
+      </w:pPr>
+    </w:p>
+    <w:p>
+      <w:pPr>
+        <w:rPr>
+          <w:b/>
+          <w:bCs/>
+        </w:rPr>
+      </w:pPr>
+    </w:p>
+    <w:p>
+      <w:pPr>
+        <w:rPr>
+          <w:b/>
+          <w:bCs/>
+        </w:rPr>
+      </w:pPr>
+    </w:p>
+    <w:p>
+      <w:pPr>
+        <w:rPr>
+          <w:b/>
+          <w:bCs/>
+        </w:rPr>
+      </w:pPr>
+    </w:p>
+    <w:p>
+      <w:pPr>
+        <w:rPr>
+          <w:b/>
+          <w:bCs/>
+        </w:rPr>
+      </w:pPr>
+    </w:p>
+    <w:p>
+      <w:pPr>
+        <w:rPr>
+          <w:b/>
+          <w:bCs/>
+        </w:rPr>
+      </w:pPr>
+    </w:p>
+    <w:p>
+      <w:pPr>
+        <w:rPr>
+          <w:b/>
+          <w:bCs/>
+        </w:rPr>
+      </w:pPr>
+    </w:p>
+    <w:p>
+      <w:pPr>
+        <w:rPr>
+          <w:b/>
+          <w:bCs/>
+        </w:rPr>
+      </w:pPr>
+    </w:p>
+    <w:p>
+      <w:pPr>
+        <w:rPr>
+          <w:b/>
+          <w:bCs/>
+        </w:rPr>
+      </w:pPr>
+    </w:p>
+    <w:p>
+      <w:pPr>
+        <w:rPr>
+          <w:b/>
+          <w:bCs/>
+        </w:rPr>
+      </w:pPr>
+    </w:p>
+    <w:p>
+      <w:pPr>
+        <w:rPr>
+          <w:b/>
+          <w:bCs/>
+        </w:rPr>
+      </w:pPr>
+    </w:p>
+    <w:p>
+      <w:pPr>
+        <w:rPr>
+          <w:b/>
+          <w:bCs/>
+        </w:rPr>
+      </w:pPr>
+    </w:p>
+    <w:p>
+      <w:pPr>
+        <w:rPr>
+          <w:b/>
+          <w:bCs/>
+        </w:rPr>
+      </w:pPr>
+    </w:p>
+    <w:p>
+      <w:pPr>
+        <w:rPr>
+          <w:b/>
+          <w:bCs/>
+        </w:rPr>
+      </w:pPr>
+    </w:p>
+    <w:p>
+      <w:pPr>
+        <w:rPr>
+          <w:b/>
+          <w:bCs/>
+        </w:rPr>
+      </w:pPr>
+    </w:p>
+    <w:p>
+      <w:pPr>
+        <w:rPr>
+          <w:b/>
+          <w:bCs/>
+        </w:rPr>
+      </w:pPr>
+    </w:p>
+    <w:p>
+      <w:pPr>
+        <w:rPr>
+          <w:b/>
+          <w:bCs/>
+        </w:rPr>
+      </w:pPr>
+    </w:p>
+    <w:p>
+      <w:pPr>
+        <w:rPr>
+          <w:b/>
+          <w:bCs/>
+        </w:rPr>
+      </w:pPr>
+    </w:p>
+    <w:p>
+      <w:pPr>
+        <w:rPr>
+          <w:b/>
+          <w:bCs/>
+        </w:rPr>
+      </w:pPr>
+    </w:p>
+    <w:p>
+      <w:pPr>
+        <w:rPr>
+          <w:b/>
+          <w:bCs/>
+        </w:rPr>
+      </w:pPr>
+      <w:r>
+        <w:rPr>
+          <w:b/>
+          <w:bCs/>
+          <w:noProof/>
+        </w:rPr>
+        <w:drawing>
+          <wp:anchor distT="0" distB="0" distL="114300" distR="114300" simplePos="0" relativeHeight="251665408" behindDoc="1" locked="0" layoutInCell="1" allowOverlap="1" wp14:anchorId="098E4EE8" wp14:editId="17A4EABD">
+            <wp:simplePos x="0" y="0"/>
+            <wp:positionH relativeFrom="page">
+              <wp:align>center</wp:align>
+            </wp:positionH>
+            <wp:positionV relativeFrom="paragraph">
+              <wp:posOffset>19050</wp:posOffset>
+            </wp:positionV>
+            <wp:extent cx="4066832" cy="3135630"/>
+            <wp:effectExtent l="0" t="0" r="0" b="7620"/>
+            <wp:wrapNone/>
+            <wp:docPr id="266621968" name="Picture 12"/>
+            <wp:cNvGraphicFramePr>
+              <a:graphicFrameLocks xmlns:a="http://schemas.openxmlformats.org/drawingml/2006/main" noChangeAspect="1"/>
+            </wp:cNvGraphicFramePr>
+            <a:graphic xmlns:a="http://schemas.openxmlformats.org/drawingml/2006/main">
+              <a:graphicData uri="http://schemas.openxmlformats.org/drawingml/2006/picture">
+                <pic:pic xmlns:pic="http://schemas.openxmlformats.org/drawingml/2006/picture">
+                  <pic:nvPicPr>
+                    <pic:cNvPr id="0" name="Picture 14"/>
+                    <pic:cNvPicPr>
+                      <a:picLocks noChangeAspect="1" noChangeArrowheads="1"/>
+                    </pic:cNvPicPr>
+                  </pic:nvPicPr>
+                  <pic:blipFill>
+                    <a:blip r:embed="rId23" cstate="print">
+                      <a:extLst>
+                        <a:ext uri="{28A0092B-C50C-407E-A947-70E740481C1C}">
+                          <a14:useLocalDpi xmlns:a14="http://schemas.microsoft.com/office/drawing/2010/main" val="0"/>
+                        </a:ext>
+                      </a:extLst>
+                    </a:blip>
+                    <a:srcRect/>
+                    <a:stretch>
+                      <a:fillRect/>
+                    </a:stretch>
+                  </pic:blipFill>
+                  <pic:spPr bwMode="auto">
+                    <a:xfrm>
+                      <a:off x="0" y="0"/>
+                      <a:ext cx="4066832" cy="3135630"/>
+                    </a:xfrm>
+                    <a:prstGeom prst="rect">
+                      <a:avLst/>
+                    </a:prstGeom>
+                    <a:noFill/>
+                    <a:ln>
+                      <a:noFill/>
+                    </a:ln>
+                  </pic:spPr>
+                </pic:pic>
+              </a:graphicData>
+            </a:graphic>
+            <wp14:sizeRelH relativeFrom="margin">
+              <wp14:pctWidth>0</wp14:pctWidth>
+            </wp14:sizeRelH>
+            <wp14:sizeRelV relativeFrom="margin">
+              <wp14:pctHeight>0</wp14:pctHeight>
+            </wp14:sizeRelV>
+          </wp:anchor>
+        </w:drawing>
+      </w:r>
+    </w:p>
+    <w:p>
+      <w:pPr>
+        <w:rPr>
+          <w:b/>
+          <w:bCs/>
+        </w:rPr>
+      </w:pPr>
+    </w:p>
+    <w:p>
+      <w:pPr>
+        <w:rPr>
+          <w:b/>
+          <w:bCs/>
+        </w:rPr>
+      </w:pPr>
+    </w:p>
+    <w:p>
+      <w:pPr>
+        <w:rPr>
+          <w:b/>
+          <w:bCs/>
+        </w:rPr>
+      </w:pPr>
+    </w:p>
+    <w:p>
+      <w:pPr>
+        <w:rPr>
+          <w:b/>
+          <w:bCs/>
+        </w:rPr>
+      </w:pPr>
+    </w:p>
+    <w:p>
+      <w:pPr>
+        <w:rPr>
+          <w:b/>
+          <w:bCs/>
+        </w:rPr>
+      </w:pPr>
+    </w:p>
+    <w:p>
+      <w:pPr>
+        <w:rPr>
+          <w:b/>
+          <w:bCs/>
+        </w:rPr>
+      </w:pPr>
+    </w:p>
+    <w:p>
+      <w:pPr>
+        <w:rPr>
+          <w:b/>
+          <w:bCs/>
+        </w:rPr>
+      </w:pPr>
+    </w:p>
+    <w:p>
+      <w:pPr>
+        <w:rPr>
+          <w:b/>
+          <w:bCs/>
+        </w:rPr>
+      </w:pPr>
+    </w:p>
+    <w:p>
+      <w:pPr>
+        <w:rPr>
+          <w:b/>
+          <w:bCs/>
+        </w:rPr>
+      </w:pPr>
+    </w:p>
+    <w:p>
+      <w:pPr>
+        <w:rPr>
+          <w:b/>
+          <w:bCs/>
+        </w:rPr>
+      </w:pPr>
+    </w:p>
+    <w:p>
+      <w:pPr>
+        <w:rPr>
+          <w:b/>
+          <w:bCs/>
+        </w:rPr>
+      </w:pPr>
+    </w:p>
+    <w:p>
+      <w:pPr>
+        <w:rPr>
+          <w:b/>
+          <w:bCs/>
+        </w:rPr>
+      </w:pPr>
+    </w:p>
+    <w:p>
+      <w:pPr>
+        <w:rPr>
+          <w:b/>
+          <w:bCs/>
+        </w:rPr>
+      </w:pPr>
+    </w:p>
+    <w:p>
+      <w:pPr>
+        <w:rPr>
+          <w:b/>
+          <w:bCs/>
+        </w:rPr>
+      </w:pPr>
+    </w:p>
+    <w:p>
+      <w:pPr>
+        <w:rPr>
+          <w:b/>
+          <w:bCs/>
+        </w:rPr>
+      </w:pPr>
+    </w:p>
+    <w:p>
+      <w:pPr>
+        <w:rPr>
+          <w:b/>
+          <w:bCs/>
+        </w:rPr>
+      </w:pPr>
+    </w:p>
+    <w:p>
+      <w:pPr>
+        <w:rPr>
+          <w:b/>
+          <w:bCs/>
+        </w:rPr>
+      </w:pPr>
+    </w:p>
+    <w:p>
+      <w:pPr>
+        <w:rPr>
+          <w:b/>
+          <w:bCs/>
+        </w:rPr>
+      </w:pPr>
+    </w:p>
+    <w:p>
+      <w:pPr>
+        <w:rPr>
+          <w:b/>
+          <w:bCs/>
+        </w:rPr>
+      </w:pPr>
+    </w:p>
+    <w:p>
+      <w:pPr>
+        <w:rPr>
+          <w:b/>
+          <w:bCs/>
+        </w:rPr>
+      </w:pPr>
+    </w:p>
+    <w:p>
+      <w:pPr>
+        <w:rPr>
+          <w:b/>
+          <w:bCs/>
+        </w:rPr>
+      </w:pPr>
+    </w:p>
+    <w:p>
+      <w:pPr>
+        <w:rPr>
+          <w:b/>
+          <w:bCs/>
+        </w:rPr>
+      </w:pPr>
+    </w:p>
+    <w:p>
+      <w:pPr>
+        <w:rPr>
+          <w:b/>
+          <w:bCs/>
+        </w:rPr>
+      </w:pPr>
+      <w:r>
+        <w:rPr>
+          <w:b/>
+          <w:bCs/>
+          <w:noProof/>
+        </w:rPr>
+        <w:drawing>
+          <wp:anchor distT="0" distB="0" distL="114300" distR="114300" simplePos="0" relativeHeight="251666432" behindDoc="1" locked="0" layoutInCell="1" allowOverlap="1" wp14:anchorId="5E6CB4DE" wp14:editId="012C32C9">
+            <wp:simplePos x="0" y="0"/>
+            <wp:positionH relativeFrom="column">
+              <wp:posOffset>1905</wp:posOffset>
+            </wp:positionH>
+            <wp:positionV relativeFrom="paragraph">
+              <wp:posOffset>0</wp:posOffset>
+            </wp:positionV>
+            <wp:extent cx="6168390" cy="2270760"/>
+            <wp:effectExtent l="0" t="0" r="3810" b="0"/>
+            <wp:wrapNone/>
+            <wp:docPr id="161578718" name="Picture 13"/>
+            <wp:cNvGraphicFramePr>
+              <a:graphicFrameLocks xmlns:a="http://schemas.openxmlformats.org/drawingml/2006/main" noChangeAspect="1"/>
+            </wp:cNvGraphicFramePr>
+            <a:graphic xmlns:a="http://schemas.openxmlformats.org/drawingml/2006/main">
+              <a:graphicData uri="http://schemas.openxmlformats.org/drawingml/2006/picture">
+                <pic:pic xmlns:pic="http://schemas.openxmlformats.org/drawingml/2006/picture">
+                  <pic:nvPicPr>
+                    <pic:cNvPr id="0" name="Picture 15"/>
+                    <pic:cNvPicPr>
+                      <a:picLocks noChangeAspect="1" noChangeArrowheads="1"/>
+                    </pic:cNvPicPr>
+                  </pic:nvPicPr>
+                  <pic:blipFill>
+                    <a:blip r:embed="rId24" cstate="print">
+                      <a:extLst>
+                        <a:ext uri="{28A0092B-C50C-407E-A947-70E740481C1C}">
+                          <a14:useLocalDpi xmlns:a14="http://schemas.microsoft.com/office/drawing/2010/main" val="0"/>
+                        </a:ext>
+                      </a:extLst>
+                    </a:blip>
+                    <a:srcRect/>
+                    <a:stretch>
+                      <a:fillRect/>
+                    </a:stretch>
+                  </pic:blipFill>
+                  <pic:spPr bwMode="auto">
+                    <a:xfrm>
+                      <a:off x="0" y="0"/>
+                      <a:ext cx="6168390" cy="2270760"/>
+                    </a:xfrm>
+                    <a:prstGeom prst="rect">
+                      <a:avLst/>
+                    </a:prstGeom>
+                    <a:noFill/>
+                    <a:ln>
+                      <a:noFill/>
+                    </a:ln>
+                  </pic:spPr>
+                </pic:pic>
+              </a:graphicData>
+            </a:graphic>
+          </wp:anchor>
+        </w:drawing>
+      </w:r>
+    </w:p>
     <w:sectPr>
       <w:pgSz w:w="11904" w:h="16840"/>
       <w:pgMar w:top="1446" w:right="704" w:bottom="1553" w:left="1425" w:header="720" w:footer="720" w:gutter="0"/>

</xml_diff>